<commit_message>
Fix spacing in all 21 framed boxes (encadrés)
Increased internal header cell padding from 5pt to 8pt top/bottom and
10pt to 18pt sides. Added gold border (#C8A000) around all 21 tables.
Applied consistent body cell spacing across both editions.

https://claude.ai/code/session_01AcYUBsVb6AAEgmkQXpa8dS
</commit_message>
<xml_diff>
--- a/LA_PAIX_ON_PEUT_L_EVITER_geopolitique.docx
+++ b/LA_PAIX_ON_PEUT_L_EVITER_geopolitique.docx
@@ -1063,18 +1063,18 @@
     <w:tbl>
       <w:tblPr>
         <w:tblStyle w:val="a"/>
-        <w:tblW w:w="8640" w:type="dxa"/>
         <w:tblInd w:w="0" w:type="dxa"/>
-        <w:tblBorders>
-          <w:top w:val="single" w:sz="4" w:space="0" w:color="000000"/>
-          <w:left w:val="single" w:sz="4" w:space="0" w:color="000000"/>
-          <w:bottom w:val="single" w:sz="4" w:space="0" w:color="000000"/>
-          <w:right w:val="single" w:sz="4" w:space="0" w:color="000000"/>
-          <w:insideH w:val="single" w:sz="4" w:space="0" w:color="000000"/>
-          <w:insideV w:val="single" w:sz="4" w:space="0" w:color="000000"/>
-        </w:tblBorders>
         <w:tblLayout w:type="fixed"/>
         <w:tblLook w:val="0000" w:firstRow="0" w:lastRow="0" w:firstColumn="0" w:lastColumn="0" w:noHBand="0" w:noVBand="0"/>
+        <w:tblBorders>
+          <w:top w:val="single" w:sz="8" w:space="0" w:color="C8A000"/>
+          <w:left w:val="single" w:sz="8" w:space="0" w:color="C8A000"/>
+          <w:bottom w:val="single" w:sz="8" w:space="0" w:color="C8A000"/>
+          <w:right w:val="single" w:sz="8" w:space="0" w:color="C8A000"/>
+          <w:insideH w:val="none"/>
+          <w:insideV w:val="none"/>
+        </w:tblBorders>
+        <w:tblW w:w="5000" w:type="pct"/>
       </w:tblPr>
       <w:tblGrid>
         <w:gridCol w:w="8640"/>
@@ -1089,17 +1089,17 @@
               <w:bottom w:val="single" w:sz="4" w:space="0" w:color="C8A951"/>
               <w:right w:val="nil"/>
             </w:tcBorders>
+            <w:shd w:val="clear" w:color="auto" w:fill="1A1A2E"/>
             <w:tcMar>
-              <w:top w:w="100" w:type="dxa"/>
-              <w:left w:w="200" w:type="dxa"/>
-              <w:bottom w:w="100" w:type="dxa"/>
-              <w:right w:w="200" w:type="dxa"/>
+              <w:top w:w="160" w:type="dxa"/>
+              <w:left w:w="360" w:type="dxa"/>
+              <w:bottom w:w="160" w:type="dxa"/>
+              <w:right w:w="360" w:type="dxa"/>
             </w:tcMar>
-            <w:shd w:val="clear" w:color="auto" w:fill="1A1A2E"/>
           </w:tcPr>
           <w:p>
             <w:pPr>
-              <w:spacing w:before="60" w:after="60"/>
+              <w:spacing w:before="0" w:after="0"/>
             </w:pPr>
             <w:r>
               <w:rPr>
@@ -1126,15 +1126,15 @@
             </w:tcBorders>
             <w:shd w:val="clear" w:color="auto" w:fill="F5F5F0"/>
             <w:tcMar>
-              <w:top w:w="50" w:type="dxa"/>
+              <w:top w:w="80" w:type="dxa"/>
               <w:left w:w="200" w:type="dxa"/>
-              <w:bottom w:w="50" w:type="dxa"/>
+              <w:bottom w:w="80" w:type="dxa"/>
               <w:right w:w="200" w:type="dxa"/>
             </w:tcMar>
           </w:tcPr>
           <w:p>
             <w:pPr>
-              <w:spacing w:before="36" w:after="36"/>
+              <w:spacing w:before="20" w:after="60"/>
             </w:pPr>
             <w:r>
               <w:rPr>
@@ -1160,15 +1160,15 @@
             </w:tcBorders>
             <w:shd w:val="clear" w:color="auto" w:fill="F5F5F0"/>
             <w:tcMar>
-              <w:top w:w="50" w:type="dxa"/>
+              <w:top w:w="80" w:type="dxa"/>
               <w:left w:w="200" w:type="dxa"/>
-              <w:bottom w:w="50" w:type="dxa"/>
+              <w:bottom w:w="80" w:type="dxa"/>
               <w:right w:w="200" w:type="dxa"/>
             </w:tcMar>
           </w:tcPr>
           <w:p>
             <w:pPr>
-              <w:spacing w:before="36" w:after="36"/>
+              <w:spacing w:before="20" w:after="60"/>
             </w:pPr>
             <w:r>
               <w:rPr>
@@ -1194,15 +1194,15 @@
             </w:tcBorders>
             <w:shd w:val="clear" w:color="auto" w:fill="F5F5F0"/>
             <w:tcMar>
-              <w:top w:w="50" w:type="dxa"/>
+              <w:top w:w="80" w:type="dxa"/>
               <w:left w:w="200" w:type="dxa"/>
-              <w:bottom w:w="50" w:type="dxa"/>
+              <w:bottom w:w="80" w:type="dxa"/>
               <w:right w:w="200" w:type="dxa"/>
             </w:tcMar>
           </w:tcPr>
           <w:p>
             <w:pPr>
-              <w:spacing w:before="36" w:after="36"/>
+              <w:spacing w:before="20" w:after="60"/>
             </w:pPr>
             <w:r>
               <w:rPr>
@@ -1228,15 +1228,15 @@
             </w:tcBorders>
             <w:shd w:val="clear" w:color="auto" w:fill="F5F5F0"/>
             <w:tcMar>
-              <w:top w:w="50" w:type="dxa"/>
+              <w:top w:w="80" w:type="dxa"/>
               <w:left w:w="200" w:type="dxa"/>
-              <w:bottom w:w="50" w:type="dxa"/>
+              <w:bottom w:w="80" w:type="dxa"/>
               <w:right w:w="200" w:type="dxa"/>
             </w:tcMar>
           </w:tcPr>
           <w:p>
             <w:pPr>
-              <w:spacing w:before="36" w:after="36"/>
+              <w:spacing w:before="20" w:after="60"/>
             </w:pPr>
             <w:r>
               <w:rPr>
@@ -1262,15 +1262,15 @@
             </w:tcBorders>
             <w:shd w:val="clear" w:color="auto" w:fill="F5F5F0"/>
             <w:tcMar>
-              <w:top w:w="50" w:type="dxa"/>
+              <w:top w:w="80" w:type="dxa"/>
               <w:left w:w="200" w:type="dxa"/>
-              <w:bottom w:w="50" w:type="dxa"/>
+              <w:bottom w:w="80" w:type="dxa"/>
               <w:right w:w="200" w:type="dxa"/>
             </w:tcMar>
           </w:tcPr>
           <w:p>
             <w:pPr>
-              <w:spacing w:before="36" w:after="36"/>
+              <w:spacing w:before="20" w:after="60"/>
             </w:pPr>
             <w:r>
               <w:rPr>
@@ -1296,15 +1296,15 @@
             </w:tcBorders>
             <w:shd w:val="clear" w:color="auto" w:fill="F5F5F0"/>
             <w:tcMar>
-              <w:top w:w="50" w:type="dxa"/>
+              <w:top w:w="80" w:type="dxa"/>
               <w:left w:w="200" w:type="dxa"/>
-              <w:bottom w:w="50" w:type="dxa"/>
+              <w:bottom w:w="80" w:type="dxa"/>
               <w:right w:w="200" w:type="dxa"/>
             </w:tcMar>
           </w:tcPr>
           <w:p>
             <w:pPr>
-              <w:spacing w:before="36" w:after="36"/>
+              <w:spacing w:before="20" w:after="60"/>
             </w:pPr>
             <w:r>
               <w:rPr>
@@ -1614,18 +1614,18 @@
     <w:tbl>
       <w:tblPr>
         <w:tblStyle w:val="a0"/>
-        <w:tblW w:w="8640" w:type="dxa"/>
         <w:tblInd w:w="0" w:type="dxa"/>
-        <w:tblBorders>
-          <w:top w:val="single" w:sz="4" w:space="0" w:color="000000"/>
-          <w:left w:val="single" w:sz="4" w:space="0" w:color="000000"/>
-          <w:bottom w:val="single" w:sz="4" w:space="0" w:color="000000"/>
-          <w:right w:val="single" w:sz="4" w:space="0" w:color="000000"/>
-          <w:insideH w:val="single" w:sz="4" w:space="0" w:color="000000"/>
-          <w:insideV w:val="single" w:sz="4" w:space="0" w:color="000000"/>
-        </w:tblBorders>
         <w:tblLayout w:type="fixed"/>
         <w:tblLook w:val="0000" w:firstRow="0" w:lastRow="0" w:firstColumn="0" w:lastColumn="0" w:noHBand="0" w:noVBand="0"/>
+        <w:tblBorders>
+          <w:top w:val="single" w:sz="8" w:space="0" w:color="C8A000"/>
+          <w:left w:val="single" w:sz="8" w:space="0" w:color="C8A000"/>
+          <w:bottom w:val="single" w:sz="8" w:space="0" w:color="C8A000"/>
+          <w:right w:val="single" w:sz="8" w:space="0" w:color="C8A000"/>
+          <w:insideH w:val="none"/>
+          <w:insideV w:val="none"/>
+        </w:tblBorders>
+        <w:tblW w:w="5000" w:type="pct"/>
       </w:tblPr>
       <w:tblGrid>
         <w:gridCol w:w="8640"/>
@@ -1640,17 +1640,17 @@
               <w:bottom w:val="single" w:sz="4" w:space="0" w:color="C8A951"/>
               <w:right w:val="nil"/>
             </w:tcBorders>
+            <w:shd w:val="clear" w:color="auto" w:fill="1A1A2E"/>
             <w:tcMar>
-              <w:top w:w="100" w:type="dxa"/>
-              <w:left w:w="200" w:type="dxa"/>
-              <w:bottom w:w="100" w:type="dxa"/>
-              <w:right w:w="200" w:type="dxa"/>
+              <w:top w:w="160" w:type="dxa"/>
+              <w:left w:w="360" w:type="dxa"/>
+              <w:bottom w:w="160" w:type="dxa"/>
+              <w:right w:w="360" w:type="dxa"/>
             </w:tcMar>
-            <w:shd w:val="clear" w:color="auto" w:fill="1A1A2E"/>
           </w:tcPr>
           <w:p>
             <w:pPr>
-              <w:spacing w:before="60" w:after="60"/>
+              <w:spacing w:before="0" w:after="0"/>
             </w:pPr>
             <w:r>
               <w:rPr>
@@ -1676,15 +1676,15 @@
             </w:tcBorders>
             <w:shd w:val="clear" w:color="auto" w:fill="F5F5F0"/>
             <w:tcMar>
-              <w:top w:w="50" w:type="dxa"/>
+              <w:top w:w="80" w:type="dxa"/>
               <w:left w:w="200" w:type="dxa"/>
-              <w:bottom w:w="50" w:type="dxa"/>
+              <w:bottom w:w="80" w:type="dxa"/>
               <w:right w:w="200" w:type="dxa"/>
             </w:tcMar>
           </w:tcPr>
           <w:p>
             <w:pPr>
-              <w:spacing w:before="36" w:after="36"/>
+              <w:spacing w:before="20" w:after="60"/>
             </w:pPr>
             <w:r>
               <w:rPr>
@@ -1710,15 +1710,15 @@
             </w:tcBorders>
             <w:shd w:val="clear" w:color="auto" w:fill="F5F5F0"/>
             <w:tcMar>
-              <w:top w:w="50" w:type="dxa"/>
+              <w:top w:w="80" w:type="dxa"/>
               <w:left w:w="200" w:type="dxa"/>
-              <w:bottom w:w="50" w:type="dxa"/>
+              <w:bottom w:w="80" w:type="dxa"/>
               <w:right w:w="200" w:type="dxa"/>
             </w:tcMar>
           </w:tcPr>
           <w:p>
             <w:pPr>
-              <w:spacing w:before="36" w:after="36"/>
+              <w:spacing w:before="20" w:after="60"/>
             </w:pPr>
             <w:r>
               <w:rPr>
@@ -1744,15 +1744,15 @@
             </w:tcBorders>
             <w:shd w:val="clear" w:color="auto" w:fill="F5F5F0"/>
             <w:tcMar>
-              <w:top w:w="50" w:type="dxa"/>
+              <w:top w:w="80" w:type="dxa"/>
               <w:left w:w="200" w:type="dxa"/>
-              <w:bottom w:w="50" w:type="dxa"/>
+              <w:bottom w:w="80" w:type="dxa"/>
               <w:right w:w="200" w:type="dxa"/>
             </w:tcMar>
           </w:tcPr>
           <w:p>
             <w:pPr>
-              <w:spacing w:before="36" w:after="36"/>
+              <w:spacing w:before="20" w:after="60"/>
             </w:pPr>
             <w:r>
               <w:rPr>
@@ -1778,15 +1778,15 @@
             </w:tcBorders>
             <w:shd w:val="clear" w:color="auto" w:fill="F5F5F0"/>
             <w:tcMar>
-              <w:top w:w="50" w:type="dxa"/>
+              <w:top w:w="80" w:type="dxa"/>
               <w:left w:w="200" w:type="dxa"/>
-              <w:bottom w:w="50" w:type="dxa"/>
+              <w:bottom w:w="80" w:type="dxa"/>
               <w:right w:w="200" w:type="dxa"/>
             </w:tcMar>
           </w:tcPr>
           <w:p>
             <w:pPr>
-              <w:spacing w:before="36" w:after="36"/>
+              <w:spacing w:before="20" w:after="60"/>
             </w:pPr>
             <w:r>
               <w:rPr>
@@ -1812,15 +1812,15 @@
             </w:tcBorders>
             <w:shd w:val="clear" w:color="auto" w:fill="F5F5F0"/>
             <w:tcMar>
-              <w:top w:w="50" w:type="dxa"/>
+              <w:top w:w="80" w:type="dxa"/>
               <w:left w:w="200" w:type="dxa"/>
-              <w:bottom w:w="50" w:type="dxa"/>
+              <w:bottom w:w="80" w:type="dxa"/>
               <w:right w:w="200" w:type="dxa"/>
             </w:tcMar>
           </w:tcPr>
           <w:p>
             <w:pPr>
-              <w:spacing w:before="36" w:after="36"/>
+              <w:spacing w:before="20" w:after="60"/>
             </w:pPr>
             <w:r>
               <w:rPr>
@@ -1846,15 +1846,15 @@
             </w:tcBorders>
             <w:shd w:val="clear" w:color="auto" w:fill="F5F5F0"/>
             <w:tcMar>
-              <w:top w:w="50" w:type="dxa"/>
+              <w:top w:w="80" w:type="dxa"/>
               <w:left w:w="200" w:type="dxa"/>
-              <w:bottom w:w="50" w:type="dxa"/>
+              <w:bottom w:w="80" w:type="dxa"/>
               <w:right w:w="200" w:type="dxa"/>
             </w:tcMar>
           </w:tcPr>
           <w:p>
             <w:pPr>
-              <w:spacing w:before="36" w:after="36"/>
+              <w:spacing w:before="20" w:after="60"/>
             </w:pPr>
             <w:r>
               <w:rPr>
@@ -1880,15 +1880,15 @@
             </w:tcBorders>
             <w:shd w:val="clear" w:color="auto" w:fill="F5F5F0"/>
             <w:tcMar>
-              <w:top w:w="50" w:type="dxa"/>
+              <w:top w:w="80" w:type="dxa"/>
               <w:left w:w="200" w:type="dxa"/>
-              <w:bottom w:w="50" w:type="dxa"/>
+              <w:bottom w:w="80" w:type="dxa"/>
               <w:right w:w="200" w:type="dxa"/>
             </w:tcMar>
           </w:tcPr>
           <w:p>
             <w:pPr>
-              <w:spacing w:before="36" w:after="36"/>
+              <w:spacing w:before="20" w:after="60"/>
             </w:pPr>
             <w:r>
               <w:rPr>
@@ -1914,15 +1914,15 @@
             </w:tcBorders>
             <w:shd w:val="clear" w:color="auto" w:fill="F5F5F0"/>
             <w:tcMar>
-              <w:top w:w="50" w:type="dxa"/>
+              <w:top w:w="80" w:type="dxa"/>
               <w:left w:w="200" w:type="dxa"/>
-              <w:bottom w:w="50" w:type="dxa"/>
+              <w:bottom w:w="80" w:type="dxa"/>
               <w:right w:w="200" w:type="dxa"/>
             </w:tcMar>
           </w:tcPr>
           <w:p>
             <w:pPr>
-              <w:spacing w:before="36" w:after="36"/>
+              <w:spacing w:before="20" w:after="60"/>
             </w:pPr>
             <w:r>
               <w:rPr>
@@ -2121,18 +2121,18 @@
     <w:tbl>
       <w:tblPr>
         <w:tblStyle w:val="a1"/>
-        <w:tblW w:w="8640" w:type="dxa"/>
         <w:tblInd w:w="0" w:type="dxa"/>
-        <w:tblBorders>
-          <w:top w:val="single" w:sz="4" w:space="0" w:color="000000"/>
-          <w:left w:val="single" w:sz="4" w:space="0" w:color="000000"/>
-          <w:bottom w:val="single" w:sz="4" w:space="0" w:color="000000"/>
-          <w:right w:val="single" w:sz="4" w:space="0" w:color="000000"/>
-          <w:insideH w:val="single" w:sz="4" w:space="0" w:color="000000"/>
-          <w:insideV w:val="single" w:sz="4" w:space="0" w:color="000000"/>
-        </w:tblBorders>
         <w:tblLayout w:type="fixed"/>
         <w:tblLook w:val="0000" w:firstRow="0" w:lastRow="0" w:firstColumn="0" w:lastColumn="0" w:noHBand="0" w:noVBand="0"/>
+        <w:tblBorders>
+          <w:top w:val="single" w:sz="8" w:space="0" w:color="C8A000"/>
+          <w:left w:val="single" w:sz="8" w:space="0" w:color="C8A000"/>
+          <w:bottom w:val="single" w:sz="8" w:space="0" w:color="C8A000"/>
+          <w:right w:val="single" w:sz="8" w:space="0" w:color="C8A000"/>
+          <w:insideH w:val="none"/>
+          <w:insideV w:val="none"/>
+        </w:tblBorders>
+        <w:tblW w:w="5000" w:type="pct"/>
       </w:tblPr>
       <w:tblGrid>
         <w:gridCol w:w="8640"/>
@@ -2147,17 +2147,17 @@
               <w:bottom w:val="single" w:sz="4" w:space="0" w:color="C8A951"/>
               <w:right w:val="nil"/>
             </w:tcBorders>
+            <w:shd w:val="clear" w:color="auto" w:fill="1A1A2E"/>
             <w:tcMar>
-              <w:top w:w="100" w:type="dxa"/>
-              <w:left w:w="200" w:type="dxa"/>
-              <w:bottom w:w="100" w:type="dxa"/>
-              <w:right w:w="200" w:type="dxa"/>
+              <w:top w:w="160" w:type="dxa"/>
+              <w:left w:w="360" w:type="dxa"/>
+              <w:bottom w:w="160" w:type="dxa"/>
+              <w:right w:w="360" w:type="dxa"/>
             </w:tcMar>
-            <w:shd w:val="clear" w:color="auto" w:fill="1A1A2E"/>
           </w:tcPr>
           <w:p>
             <w:pPr>
-              <w:spacing w:before="60" w:after="60"/>
+              <w:spacing w:before="0" w:after="0"/>
             </w:pPr>
             <w:r>
               <w:rPr>
@@ -2183,15 +2183,15 @@
             </w:tcBorders>
             <w:shd w:val="clear" w:color="auto" w:fill="F5F5F0"/>
             <w:tcMar>
-              <w:top w:w="50" w:type="dxa"/>
+              <w:top w:w="80" w:type="dxa"/>
               <w:left w:w="200" w:type="dxa"/>
-              <w:bottom w:w="50" w:type="dxa"/>
+              <w:bottom w:w="80" w:type="dxa"/>
               <w:right w:w="200" w:type="dxa"/>
             </w:tcMar>
           </w:tcPr>
           <w:p>
             <w:pPr>
-              <w:spacing w:before="36" w:after="36"/>
+              <w:spacing w:before="20" w:after="60"/>
             </w:pPr>
             <w:r>
               <w:rPr>
@@ -2217,15 +2217,15 @@
             </w:tcBorders>
             <w:shd w:val="clear" w:color="auto" w:fill="F5F5F0"/>
             <w:tcMar>
-              <w:top w:w="50" w:type="dxa"/>
+              <w:top w:w="80" w:type="dxa"/>
               <w:left w:w="200" w:type="dxa"/>
-              <w:bottom w:w="50" w:type="dxa"/>
+              <w:bottom w:w="80" w:type="dxa"/>
               <w:right w:w="200" w:type="dxa"/>
             </w:tcMar>
           </w:tcPr>
           <w:p>
             <w:pPr>
-              <w:spacing w:before="36" w:after="36"/>
+              <w:spacing w:before="20" w:after="60"/>
             </w:pPr>
             <w:r>
               <w:rPr>
@@ -2251,15 +2251,15 @@
             </w:tcBorders>
             <w:shd w:val="clear" w:color="auto" w:fill="F5F5F0"/>
             <w:tcMar>
-              <w:top w:w="50" w:type="dxa"/>
+              <w:top w:w="80" w:type="dxa"/>
               <w:left w:w="200" w:type="dxa"/>
-              <w:bottom w:w="50" w:type="dxa"/>
+              <w:bottom w:w="80" w:type="dxa"/>
               <w:right w:w="200" w:type="dxa"/>
             </w:tcMar>
           </w:tcPr>
           <w:p>
             <w:pPr>
-              <w:spacing w:before="36" w:after="36"/>
+              <w:spacing w:before="20" w:after="60"/>
             </w:pPr>
             <w:r>
               <w:rPr>
@@ -2285,15 +2285,15 @@
             </w:tcBorders>
             <w:shd w:val="clear" w:color="auto" w:fill="F5F5F0"/>
             <w:tcMar>
-              <w:top w:w="50" w:type="dxa"/>
+              <w:top w:w="80" w:type="dxa"/>
               <w:left w:w="200" w:type="dxa"/>
-              <w:bottom w:w="50" w:type="dxa"/>
+              <w:bottom w:w="80" w:type="dxa"/>
               <w:right w:w="200" w:type="dxa"/>
             </w:tcMar>
           </w:tcPr>
           <w:p>
             <w:pPr>
-              <w:spacing w:before="36" w:after="36"/>
+              <w:spacing w:before="20" w:after="60"/>
             </w:pPr>
             <w:r>
               <w:rPr>
@@ -2339,15 +2339,15 @@
             </w:tcBorders>
             <w:shd w:val="clear" w:color="auto" w:fill="F5F5F0"/>
             <w:tcMar>
-              <w:top w:w="50" w:type="dxa"/>
+              <w:top w:w="80" w:type="dxa"/>
               <w:left w:w="200" w:type="dxa"/>
-              <w:bottom w:w="50" w:type="dxa"/>
+              <w:bottom w:w="80" w:type="dxa"/>
               <w:right w:w="200" w:type="dxa"/>
             </w:tcMar>
           </w:tcPr>
           <w:p>
             <w:pPr>
-              <w:spacing w:before="36" w:after="36"/>
+              <w:spacing w:before="20" w:after="60"/>
             </w:pPr>
             <w:r>
               <w:rPr>
@@ -2373,15 +2373,15 @@
             </w:tcBorders>
             <w:shd w:val="clear" w:color="auto" w:fill="F5F5F0"/>
             <w:tcMar>
-              <w:top w:w="50" w:type="dxa"/>
+              <w:top w:w="80" w:type="dxa"/>
               <w:left w:w="200" w:type="dxa"/>
-              <w:bottom w:w="50" w:type="dxa"/>
+              <w:bottom w:w="80" w:type="dxa"/>
               <w:right w:w="200" w:type="dxa"/>
             </w:tcMar>
           </w:tcPr>
           <w:p>
             <w:pPr>
-              <w:spacing w:before="36" w:after="36"/>
+              <w:spacing w:before="20" w:after="60"/>
             </w:pPr>
             <w:r>
               <w:rPr>
@@ -2407,15 +2407,15 @@
             </w:tcBorders>
             <w:shd w:val="clear" w:color="auto" w:fill="F5F5F0"/>
             <w:tcMar>
-              <w:top w:w="50" w:type="dxa"/>
+              <w:top w:w="80" w:type="dxa"/>
               <w:left w:w="200" w:type="dxa"/>
-              <w:bottom w:w="50" w:type="dxa"/>
+              <w:bottom w:w="80" w:type="dxa"/>
               <w:right w:w="200" w:type="dxa"/>
             </w:tcMar>
           </w:tcPr>
           <w:p>
             <w:pPr>
-              <w:spacing w:before="36" w:after="36"/>
+              <w:spacing w:before="20" w:after="60"/>
             </w:pPr>
             <w:r>
               <w:rPr>
@@ -2535,18 +2535,18 @@
     <w:tbl>
       <w:tblPr>
         <w:tblStyle w:val="a2"/>
-        <w:tblW w:w="8640" w:type="dxa"/>
         <w:tblInd w:w="0" w:type="dxa"/>
-        <w:tblBorders>
-          <w:top w:val="single" w:sz="4" w:space="0" w:color="000000"/>
-          <w:left w:val="single" w:sz="4" w:space="0" w:color="000000"/>
-          <w:bottom w:val="single" w:sz="4" w:space="0" w:color="000000"/>
-          <w:right w:val="single" w:sz="4" w:space="0" w:color="000000"/>
-          <w:insideH w:val="single" w:sz="4" w:space="0" w:color="000000"/>
-          <w:insideV w:val="single" w:sz="4" w:space="0" w:color="000000"/>
-        </w:tblBorders>
         <w:tblLayout w:type="fixed"/>
         <w:tblLook w:val="0000" w:firstRow="0" w:lastRow="0" w:firstColumn="0" w:lastColumn="0" w:noHBand="0" w:noVBand="0"/>
+        <w:tblBorders>
+          <w:top w:val="single" w:sz="8" w:space="0" w:color="C8A000"/>
+          <w:left w:val="single" w:sz="8" w:space="0" w:color="C8A000"/>
+          <w:bottom w:val="single" w:sz="8" w:space="0" w:color="C8A000"/>
+          <w:right w:val="single" w:sz="8" w:space="0" w:color="C8A000"/>
+          <w:insideH w:val="none"/>
+          <w:insideV w:val="none"/>
+        </w:tblBorders>
+        <w:tblW w:w="5000" w:type="pct"/>
       </w:tblPr>
       <w:tblGrid>
         <w:gridCol w:w="8640"/>
@@ -2561,17 +2561,17 @@
               <w:bottom w:val="single" w:sz="4" w:space="0" w:color="C8A951"/>
               <w:right w:val="nil"/>
             </w:tcBorders>
+            <w:shd w:val="clear" w:color="auto" w:fill="1A1A2E"/>
             <w:tcMar>
-              <w:top w:w="100" w:type="dxa"/>
-              <w:left w:w="200" w:type="dxa"/>
-              <w:bottom w:w="100" w:type="dxa"/>
-              <w:right w:w="200" w:type="dxa"/>
+              <w:top w:w="160" w:type="dxa"/>
+              <w:left w:w="360" w:type="dxa"/>
+              <w:bottom w:w="160" w:type="dxa"/>
+              <w:right w:w="360" w:type="dxa"/>
             </w:tcMar>
-            <w:shd w:val="clear" w:color="auto" w:fill="1A1A2E"/>
           </w:tcPr>
           <w:p>
             <w:pPr>
-              <w:spacing w:before="60" w:after="60"/>
+              <w:spacing w:before="0" w:after="0"/>
             </w:pPr>
             <w:r>
               <w:rPr>
@@ -2598,15 +2598,15 @@
             </w:tcBorders>
             <w:shd w:val="clear" w:color="auto" w:fill="F5F5F0"/>
             <w:tcMar>
-              <w:top w:w="50" w:type="dxa"/>
+              <w:top w:w="80" w:type="dxa"/>
               <w:left w:w="200" w:type="dxa"/>
-              <w:bottom w:w="50" w:type="dxa"/>
+              <w:bottom w:w="80" w:type="dxa"/>
               <w:right w:w="200" w:type="dxa"/>
             </w:tcMar>
           </w:tcPr>
           <w:p>
             <w:pPr>
-              <w:spacing w:before="36" w:after="36"/>
+              <w:spacing w:before="20" w:after="60"/>
             </w:pPr>
             <w:r>
               <w:rPr>
@@ -2632,15 +2632,15 @@
             </w:tcBorders>
             <w:shd w:val="clear" w:color="auto" w:fill="F5F5F0"/>
             <w:tcMar>
-              <w:top w:w="50" w:type="dxa"/>
+              <w:top w:w="80" w:type="dxa"/>
               <w:left w:w="200" w:type="dxa"/>
-              <w:bottom w:w="50" w:type="dxa"/>
+              <w:bottom w:w="80" w:type="dxa"/>
               <w:right w:w="200" w:type="dxa"/>
             </w:tcMar>
           </w:tcPr>
           <w:p>
             <w:pPr>
-              <w:spacing w:before="36" w:after="36"/>
+              <w:spacing w:before="20" w:after="60"/>
             </w:pPr>
             <w:r>
               <w:rPr>
@@ -2684,15 +2684,15 @@
             </w:tcBorders>
             <w:shd w:val="clear" w:color="auto" w:fill="F5F5F0"/>
             <w:tcMar>
-              <w:top w:w="50" w:type="dxa"/>
+              <w:top w:w="80" w:type="dxa"/>
               <w:left w:w="200" w:type="dxa"/>
-              <w:bottom w:w="50" w:type="dxa"/>
+              <w:bottom w:w="80" w:type="dxa"/>
               <w:right w:w="200" w:type="dxa"/>
             </w:tcMar>
           </w:tcPr>
           <w:p>
             <w:pPr>
-              <w:spacing w:before="36" w:after="36"/>
+              <w:spacing w:before="20" w:after="60"/>
             </w:pPr>
             <w:r>
               <w:rPr>
@@ -2718,15 +2718,15 @@
             </w:tcBorders>
             <w:shd w:val="clear" w:color="auto" w:fill="F5F5F0"/>
             <w:tcMar>
-              <w:top w:w="50" w:type="dxa"/>
+              <w:top w:w="80" w:type="dxa"/>
               <w:left w:w="200" w:type="dxa"/>
-              <w:bottom w:w="50" w:type="dxa"/>
+              <w:bottom w:w="80" w:type="dxa"/>
               <w:right w:w="200" w:type="dxa"/>
             </w:tcMar>
           </w:tcPr>
           <w:p>
             <w:pPr>
-              <w:spacing w:before="36" w:after="36"/>
+              <w:spacing w:before="20" w:after="60"/>
             </w:pPr>
             <w:r>
               <w:rPr>
@@ -2752,15 +2752,15 @@
             </w:tcBorders>
             <w:shd w:val="clear" w:color="auto" w:fill="F5F5F0"/>
             <w:tcMar>
-              <w:top w:w="50" w:type="dxa"/>
+              <w:top w:w="80" w:type="dxa"/>
               <w:left w:w="200" w:type="dxa"/>
-              <w:bottom w:w="50" w:type="dxa"/>
+              <w:bottom w:w="80" w:type="dxa"/>
               <w:right w:w="200" w:type="dxa"/>
             </w:tcMar>
           </w:tcPr>
           <w:p>
             <w:pPr>
-              <w:spacing w:before="36" w:after="36"/>
+              <w:spacing w:before="20" w:after="60"/>
             </w:pPr>
             <w:r>
               <w:rPr>
@@ -3075,18 +3075,18 @@
     <w:tbl>
       <w:tblPr>
         <w:tblStyle w:val="a3"/>
-        <w:tblW w:w="8640" w:type="dxa"/>
         <w:tblInd w:w="0" w:type="dxa"/>
-        <w:tblBorders>
-          <w:top w:val="single" w:sz="4" w:space="0" w:color="000000"/>
-          <w:left w:val="single" w:sz="4" w:space="0" w:color="000000"/>
-          <w:bottom w:val="single" w:sz="4" w:space="0" w:color="000000"/>
-          <w:right w:val="single" w:sz="4" w:space="0" w:color="000000"/>
-          <w:insideH w:val="single" w:sz="4" w:space="0" w:color="000000"/>
-          <w:insideV w:val="single" w:sz="4" w:space="0" w:color="000000"/>
-        </w:tblBorders>
         <w:tblLayout w:type="fixed"/>
         <w:tblLook w:val="0000" w:firstRow="0" w:lastRow="0" w:firstColumn="0" w:lastColumn="0" w:noHBand="0" w:noVBand="0"/>
+        <w:tblBorders>
+          <w:top w:val="single" w:sz="8" w:space="0" w:color="C8A000"/>
+          <w:left w:val="single" w:sz="8" w:space="0" w:color="C8A000"/>
+          <w:bottom w:val="single" w:sz="8" w:space="0" w:color="C8A000"/>
+          <w:right w:val="single" w:sz="8" w:space="0" w:color="C8A000"/>
+          <w:insideH w:val="none"/>
+          <w:insideV w:val="none"/>
+        </w:tblBorders>
+        <w:tblW w:w="5000" w:type="pct"/>
       </w:tblPr>
       <w:tblGrid>
         <w:gridCol w:w="8640"/>
@@ -3101,17 +3101,17 @@
               <w:bottom w:val="single" w:sz="4" w:space="0" w:color="C8A951"/>
               <w:right w:val="nil"/>
             </w:tcBorders>
+            <w:shd w:val="clear" w:color="auto" w:fill="1A1A2E"/>
             <w:tcMar>
-              <w:top w:w="100" w:type="dxa"/>
-              <w:left w:w="200" w:type="dxa"/>
-              <w:bottom w:w="100" w:type="dxa"/>
-              <w:right w:w="200" w:type="dxa"/>
+              <w:top w:w="160" w:type="dxa"/>
+              <w:left w:w="360" w:type="dxa"/>
+              <w:bottom w:w="160" w:type="dxa"/>
+              <w:right w:w="360" w:type="dxa"/>
             </w:tcMar>
-            <w:shd w:val="clear" w:color="auto" w:fill="1A1A2E"/>
           </w:tcPr>
           <w:p>
             <w:pPr>
-              <w:spacing w:before="60" w:after="60"/>
+              <w:spacing w:before="0" w:after="0"/>
             </w:pPr>
             <w:r>
               <w:rPr>
@@ -3138,15 +3138,15 @@
             </w:tcBorders>
             <w:shd w:val="clear" w:color="auto" w:fill="F5F5F0"/>
             <w:tcMar>
-              <w:top w:w="50" w:type="dxa"/>
+              <w:top w:w="80" w:type="dxa"/>
               <w:left w:w="200" w:type="dxa"/>
-              <w:bottom w:w="50" w:type="dxa"/>
+              <w:bottom w:w="80" w:type="dxa"/>
               <w:right w:w="200" w:type="dxa"/>
             </w:tcMar>
           </w:tcPr>
           <w:p>
             <w:pPr>
-              <w:spacing w:before="36" w:after="36"/>
+              <w:spacing w:before="20" w:after="60"/>
             </w:pPr>
             <w:r>
               <w:rPr>
@@ -3172,15 +3172,15 @@
             </w:tcBorders>
             <w:shd w:val="clear" w:color="auto" w:fill="F5F5F0"/>
             <w:tcMar>
-              <w:top w:w="50" w:type="dxa"/>
+              <w:top w:w="80" w:type="dxa"/>
               <w:left w:w="200" w:type="dxa"/>
-              <w:bottom w:w="50" w:type="dxa"/>
+              <w:bottom w:w="80" w:type="dxa"/>
               <w:right w:w="200" w:type="dxa"/>
             </w:tcMar>
           </w:tcPr>
           <w:p>
             <w:pPr>
-              <w:spacing w:before="36" w:after="36"/>
+              <w:spacing w:before="20" w:after="60"/>
             </w:pPr>
             <w:r>
               <w:rPr>
@@ -3224,15 +3224,15 @@
             </w:tcBorders>
             <w:shd w:val="clear" w:color="auto" w:fill="F5F5F0"/>
             <w:tcMar>
-              <w:top w:w="50" w:type="dxa"/>
+              <w:top w:w="80" w:type="dxa"/>
               <w:left w:w="200" w:type="dxa"/>
-              <w:bottom w:w="50" w:type="dxa"/>
+              <w:bottom w:w="80" w:type="dxa"/>
               <w:right w:w="200" w:type="dxa"/>
             </w:tcMar>
           </w:tcPr>
           <w:p>
             <w:pPr>
-              <w:spacing w:before="36" w:after="36"/>
+              <w:spacing w:before="20" w:after="60"/>
             </w:pPr>
             <w:r>
               <w:rPr>
@@ -3258,15 +3258,15 @@
             </w:tcBorders>
             <w:shd w:val="clear" w:color="auto" w:fill="F5F5F0"/>
             <w:tcMar>
-              <w:top w:w="50" w:type="dxa"/>
+              <w:top w:w="80" w:type="dxa"/>
               <w:left w:w="200" w:type="dxa"/>
-              <w:bottom w:w="50" w:type="dxa"/>
+              <w:bottom w:w="80" w:type="dxa"/>
               <w:right w:w="200" w:type="dxa"/>
             </w:tcMar>
           </w:tcPr>
           <w:p>
             <w:pPr>
-              <w:spacing w:before="36" w:after="36"/>
+              <w:spacing w:before="20" w:after="60"/>
             </w:pPr>
             <w:r>
               <w:rPr>
@@ -3292,15 +3292,15 @@
             </w:tcBorders>
             <w:shd w:val="clear" w:color="auto" w:fill="F5F5F0"/>
             <w:tcMar>
-              <w:top w:w="50" w:type="dxa"/>
+              <w:top w:w="80" w:type="dxa"/>
               <w:left w:w="200" w:type="dxa"/>
-              <w:bottom w:w="50" w:type="dxa"/>
+              <w:bottom w:w="80" w:type="dxa"/>
               <w:right w:w="200" w:type="dxa"/>
             </w:tcMar>
           </w:tcPr>
           <w:p>
             <w:pPr>
-              <w:spacing w:before="36" w:after="36"/>
+              <w:spacing w:before="20" w:after="60"/>
             </w:pPr>
             <w:r>
               <w:rPr>
@@ -3326,15 +3326,15 @@
             </w:tcBorders>
             <w:shd w:val="clear" w:color="auto" w:fill="F5F5F0"/>
             <w:tcMar>
-              <w:top w:w="50" w:type="dxa"/>
+              <w:top w:w="80" w:type="dxa"/>
               <w:left w:w="200" w:type="dxa"/>
-              <w:bottom w:w="50" w:type="dxa"/>
+              <w:bottom w:w="80" w:type="dxa"/>
               <w:right w:w="200" w:type="dxa"/>
             </w:tcMar>
           </w:tcPr>
           <w:p>
             <w:pPr>
-              <w:spacing w:before="36" w:after="36"/>
+              <w:spacing w:before="20" w:after="60"/>
             </w:pPr>
             <w:r>
               <w:rPr>
@@ -3484,18 +3484,18 @@
     <w:tbl>
       <w:tblPr>
         <w:tblStyle w:val="a4"/>
-        <w:tblW w:w="8640" w:type="dxa"/>
         <w:tblInd w:w="0" w:type="dxa"/>
-        <w:tblBorders>
-          <w:top w:val="single" w:sz="4" w:space="0" w:color="000000"/>
-          <w:left w:val="single" w:sz="4" w:space="0" w:color="000000"/>
-          <w:bottom w:val="single" w:sz="4" w:space="0" w:color="000000"/>
-          <w:right w:val="single" w:sz="4" w:space="0" w:color="000000"/>
-          <w:insideH w:val="single" w:sz="4" w:space="0" w:color="000000"/>
-          <w:insideV w:val="single" w:sz="4" w:space="0" w:color="000000"/>
-        </w:tblBorders>
         <w:tblLayout w:type="fixed"/>
         <w:tblLook w:val="0000" w:firstRow="0" w:lastRow="0" w:firstColumn="0" w:lastColumn="0" w:noHBand="0" w:noVBand="0"/>
+        <w:tblBorders>
+          <w:top w:val="single" w:sz="8" w:space="0" w:color="C8A000"/>
+          <w:left w:val="single" w:sz="8" w:space="0" w:color="C8A000"/>
+          <w:bottom w:val="single" w:sz="8" w:space="0" w:color="C8A000"/>
+          <w:right w:val="single" w:sz="8" w:space="0" w:color="C8A000"/>
+          <w:insideH w:val="none"/>
+          <w:insideV w:val="none"/>
+        </w:tblBorders>
+        <w:tblW w:w="5000" w:type="pct"/>
       </w:tblPr>
       <w:tblGrid>
         <w:gridCol w:w="8640"/>
@@ -3510,17 +3510,17 @@
               <w:bottom w:val="single" w:sz="4" w:space="0" w:color="C8A951"/>
               <w:right w:val="nil"/>
             </w:tcBorders>
+            <w:shd w:val="clear" w:color="auto" w:fill="1A1A2E"/>
             <w:tcMar>
-              <w:top w:w="100" w:type="dxa"/>
-              <w:left w:w="200" w:type="dxa"/>
-              <w:bottom w:w="100" w:type="dxa"/>
-              <w:right w:w="200" w:type="dxa"/>
+              <w:top w:w="160" w:type="dxa"/>
+              <w:left w:w="360" w:type="dxa"/>
+              <w:bottom w:w="160" w:type="dxa"/>
+              <w:right w:w="360" w:type="dxa"/>
             </w:tcMar>
-            <w:shd w:val="clear" w:color="auto" w:fill="1A1A2E"/>
           </w:tcPr>
           <w:p>
             <w:pPr>
-              <w:spacing w:before="60" w:after="60"/>
+              <w:spacing w:before="0" w:after="0"/>
             </w:pPr>
             <w:r>
               <w:rPr>
@@ -3547,15 +3547,15 @@
             </w:tcBorders>
             <w:shd w:val="clear" w:color="auto" w:fill="F5F5F0"/>
             <w:tcMar>
-              <w:top w:w="50" w:type="dxa"/>
+              <w:top w:w="80" w:type="dxa"/>
               <w:left w:w="200" w:type="dxa"/>
-              <w:bottom w:w="50" w:type="dxa"/>
+              <w:bottom w:w="80" w:type="dxa"/>
               <w:right w:w="200" w:type="dxa"/>
             </w:tcMar>
           </w:tcPr>
           <w:p>
             <w:pPr>
-              <w:spacing w:before="36" w:after="36"/>
+              <w:spacing w:before="20" w:after="60"/>
             </w:pPr>
             <w:r>
               <w:rPr>
@@ -3592,15 +3592,15 @@
             </w:tcBorders>
             <w:shd w:val="clear" w:color="auto" w:fill="F5F5F0"/>
             <w:tcMar>
-              <w:top w:w="50" w:type="dxa"/>
+              <w:top w:w="80" w:type="dxa"/>
               <w:left w:w="200" w:type="dxa"/>
-              <w:bottom w:w="50" w:type="dxa"/>
+              <w:bottom w:w="80" w:type="dxa"/>
               <w:right w:w="200" w:type="dxa"/>
             </w:tcMar>
           </w:tcPr>
           <w:p>
             <w:pPr>
-              <w:spacing w:before="36" w:after="36"/>
+              <w:spacing w:before="20" w:after="60"/>
             </w:pPr>
             <w:r>
               <w:rPr>
@@ -3626,15 +3626,15 @@
             </w:tcBorders>
             <w:shd w:val="clear" w:color="auto" w:fill="F5F5F0"/>
             <w:tcMar>
-              <w:top w:w="50" w:type="dxa"/>
+              <w:top w:w="80" w:type="dxa"/>
               <w:left w:w="200" w:type="dxa"/>
-              <w:bottom w:w="50" w:type="dxa"/>
+              <w:bottom w:w="80" w:type="dxa"/>
               <w:right w:w="200" w:type="dxa"/>
             </w:tcMar>
           </w:tcPr>
           <w:p>
             <w:pPr>
-              <w:spacing w:before="36" w:after="36"/>
+              <w:spacing w:before="20" w:after="60"/>
             </w:pPr>
             <w:r>
               <w:rPr>
@@ -3660,15 +3660,15 @@
             </w:tcBorders>
             <w:shd w:val="clear" w:color="auto" w:fill="F5F5F0"/>
             <w:tcMar>
-              <w:top w:w="50" w:type="dxa"/>
+              <w:top w:w="80" w:type="dxa"/>
               <w:left w:w="200" w:type="dxa"/>
-              <w:bottom w:w="50" w:type="dxa"/>
+              <w:bottom w:w="80" w:type="dxa"/>
               <w:right w:w="200" w:type="dxa"/>
             </w:tcMar>
           </w:tcPr>
           <w:p>
             <w:pPr>
-              <w:spacing w:before="36" w:after="36"/>
+              <w:spacing w:before="20" w:after="60"/>
             </w:pPr>
             <w:r>
               <w:rPr>
@@ -3694,15 +3694,15 @@
             </w:tcBorders>
             <w:shd w:val="clear" w:color="auto" w:fill="F5F5F0"/>
             <w:tcMar>
-              <w:top w:w="50" w:type="dxa"/>
+              <w:top w:w="80" w:type="dxa"/>
               <w:left w:w="200" w:type="dxa"/>
-              <w:bottom w:w="50" w:type="dxa"/>
+              <w:bottom w:w="80" w:type="dxa"/>
               <w:right w:w="200" w:type="dxa"/>
             </w:tcMar>
           </w:tcPr>
           <w:p>
             <w:pPr>
-              <w:spacing w:before="36" w:after="36"/>
+              <w:spacing w:before="20" w:after="60"/>
             </w:pPr>
             <w:r>
               <w:rPr>
@@ -3728,15 +3728,15 @@
             </w:tcBorders>
             <w:shd w:val="clear" w:color="auto" w:fill="F5F5F0"/>
             <w:tcMar>
-              <w:top w:w="50" w:type="dxa"/>
+              <w:top w:w="80" w:type="dxa"/>
               <w:left w:w="200" w:type="dxa"/>
-              <w:bottom w:w="50" w:type="dxa"/>
+              <w:bottom w:w="80" w:type="dxa"/>
               <w:right w:w="200" w:type="dxa"/>
             </w:tcMar>
           </w:tcPr>
           <w:p>
             <w:pPr>
-              <w:spacing w:before="36" w:after="36"/>
+              <w:spacing w:before="20" w:after="60"/>
             </w:pPr>
             <w:r>
               <w:rPr>
@@ -3762,15 +3762,15 @@
             </w:tcBorders>
             <w:shd w:val="clear" w:color="auto" w:fill="F5F5F0"/>
             <w:tcMar>
-              <w:top w:w="50" w:type="dxa"/>
+              <w:top w:w="80" w:type="dxa"/>
               <w:left w:w="200" w:type="dxa"/>
-              <w:bottom w:w="50" w:type="dxa"/>
+              <w:bottom w:w="80" w:type="dxa"/>
               <w:right w:w="200" w:type="dxa"/>
             </w:tcMar>
           </w:tcPr>
           <w:p>
             <w:pPr>
-              <w:spacing w:before="36" w:after="36"/>
+              <w:spacing w:before="20" w:after="60"/>
             </w:pPr>
             <w:r>
               <w:rPr>
@@ -3959,18 +3959,18 @@
     <w:tbl>
       <w:tblPr>
         <w:tblStyle w:val="a5"/>
-        <w:tblW w:w="8640" w:type="dxa"/>
         <w:tblInd w:w="0" w:type="dxa"/>
-        <w:tblBorders>
-          <w:top w:val="single" w:sz="4" w:space="0" w:color="000000"/>
-          <w:left w:val="single" w:sz="4" w:space="0" w:color="000000"/>
-          <w:bottom w:val="single" w:sz="4" w:space="0" w:color="000000"/>
-          <w:right w:val="single" w:sz="4" w:space="0" w:color="000000"/>
-          <w:insideH w:val="single" w:sz="4" w:space="0" w:color="000000"/>
-          <w:insideV w:val="single" w:sz="4" w:space="0" w:color="000000"/>
-        </w:tblBorders>
         <w:tblLayout w:type="fixed"/>
         <w:tblLook w:val="0000" w:firstRow="0" w:lastRow="0" w:firstColumn="0" w:lastColumn="0" w:noHBand="0" w:noVBand="0"/>
+        <w:tblBorders>
+          <w:top w:val="single" w:sz="8" w:space="0" w:color="C8A000"/>
+          <w:left w:val="single" w:sz="8" w:space="0" w:color="C8A000"/>
+          <w:bottom w:val="single" w:sz="8" w:space="0" w:color="C8A000"/>
+          <w:right w:val="single" w:sz="8" w:space="0" w:color="C8A000"/>
+          <w:insideH w:val="none"/>
+          <w:insideV w:val="none"/>
+        </w:tblBorders>
+        <w:tblW w:w="5000" w:type="pct"/>
       </w:tblPr>
       <w:tblGrid>
         <w:gridCol w:w="8640"/>
@@ -3985,17 +3985,17 @@
               <w:bottom w:val="single" w:sz="4" w:space="0" w:color="C8A951"/>
               <w:right w:val="nil"/>
             </w:tcBorders>
+            <w:shd w:val="clear" w:color="auto" w:fill="1A1A2E"/>
             <w:tcMar>
-              <w:top w:w="100" w:type="dxa"/>
-              <w:left w:w="200" w:type="dxa"/>
-              <w:bottom w:w="100" w:type="dxa"/>
-              <w:right w:w="200" w:type="dxa"/>
+              <w:top w:w="160" w:type="dxa"/>
+              <w:left w:w="360" w:type="dxa"/>
+              <w:bottom w:w="160" w:type="dxa"/>
+              <w:right w:w="360" w:type="dxa"/>
             </w:tcMar>
-            <w:shd w:val="clear" w:color="auto" w:fill="1A1A2E"/>
           </w:tcPr>
           <w:p>
             <w:pPr>
-              <w:spacing w:before="60" w:after="60"/>
+              <w:spacing w:before="0" w:after="0"/>
             </w:pPr>
             <w:r>
               <w:rPr>
@@ -4022,15 +4022,15 @@
             </w:tcBorders>
             <w:shd w:val="clear" w:color="auto" w:fill="F5F5F0"/>
             <w:tcMar>
-              <w:top w:w="50" w:type="dxa"/>
+              <w:top w:w="80" w:type="dxa"/>
               <w:left w:w="200" w:type="dxa"/>
-              <w:bottom w:w="50" w:type="dxa"/>
+              <w:bottom w:w="80" w:type="dxa"/>
               <w:right w:w="200" w:type="dxa"/>
             </w:tcMar>
           </w:tcPr>
           <w:p>
             <w:pPr>
-              <w:spacing w:before="36" w:after="36"/>
+              <w:spacing w:before="20" w:after="60"/>
             </w:pPr>
             <w:r>
               <w:rPr>
@@ -4056,15 +4056,15 @@
             </w:tcBorders>
             <w:shd w:val="clear" w:color="auto" w:fill="F5F5F0"/>
             <w:tcMar>
-              <w:top w:w="50" w:type="dxa"/>
+              <w:top w:w="80" w:type="dxa"/>
               <w:left w:w="200" w:type="dxa"/>
-              <w:bottom w:w="50" w:type="dxa"/>
+              <w:bottom w:w="80" w:type="dxa"/>
               <w:right w:w="200" w:type="dxa"/>
             </w:tcMar>
           </w:tcPr>
           <w:p>
             <w:pPr>
-              <w:spacing w:before="36" w:after="36"/>
+              <w:spacing w:before="20" w:after="60"/>
             </w:pPr>
             <w:r>
               <w:rPr>
@@ -4099,15 +4099,15 @@
             </w:tcBorders>
             <w:shd w:val="clear" w:color="auto" w:fill="F5F5F0"/>
             <w:tcMar>
-              <w:top w:w="50" w:type="dxa"/>
+              <w:top w:w="80" w:type="dxa"/>
               <w:left w:w="200" w:type="dxa"/>
-              <w:bottom w:w="50" w:type="dxa"/>
+              <w:bottom w:w="80" w:type="dxa"/>
               <w:right w:w="200" w:type="dxa"/>
             </w:tcMar>
           </w:tcPr>
           <w:p>
             <w:pPr>
-              <w:spacing w:before="36" w:after="36"/>
+              <w:spacing w:before="20" w:after="60"/>
             </w:pPr>
             <w:r>
               <w:rPr>
@@ -4151,15 +4151,15 @@
             </w:tcBorders>
             <w:shd w:val="clear" w:color="auto" w:fill="F5F5F0"/>
             <w:tcMar>
-              <w:top w:w="50" w:type="dxa"/>
+              <w:top w:w="80" w:type="dxa"/>
               <w:left w:w="200" w:type="dxa"/>
-              <w:bottom w:w="50" w:type="dxa"/>
+              <w:bottom w:w="80" w:type="dxa"/>
               <w:right w:w="200" w:type="dxa"/>
             </w:tcMar>
           </w:tcPr>
           <w:p>
             <w:pPr>
-              <w:spacing w:before="36" w:after="36"/>
+              <w:spacing w:before="20" w:after="60"/>
             </w:pPr>
             <w:r>
               <w:rPr>
@@ -4185,15 +4185,15 @@
             </w:tcBorders>
             <w:shd w:val="clear" w:color="auto" w:fill="F5F5F0"/>
             <w:tcMar>
-              <w:top w:w="50" w:type="dxa"/>
+              <w:top w:w="80" w:type="dxa"/>
               <w:left w:w="200" w:type="dxa"/>
-              <w:bottom w:w="50" w:type="dxa"/>
+              <w:bottom w:w="80" w:type="dxa"/>
               <w:right w:w="200" w:type="dxa"/>
             </w:tcMar>
           </w:tcPr>
           <w:p>
             <w:pPr>
-              <w:spacing w:before="36" w:after="36"/>
+              <w:spacing w:before="20" w:after="60"/>
             </w:pPr>
             <w:r>
               <w:rPr>
@@ -4219,15 +4219,15 @@
             </w:tcBorders>
             <w:shd w:val="clear" w:color="auto" w:fill="F5F5F0"/>
             <w:tcMar>
-              <w:top w:w="50" w:type="dxa"/>
+              <w:top w:w="80" w:type="dxa"/>
               <w:left w:w="200" w:type="dxa"/>
-              <w:bottom w:w="50" w:type="dxa"/>
+              <w:bottom w:w="80" w:type="dxa"/>
               <w:right w:w="200" w:type="dxa"/>
             </w:tcMar>
           </w:tcPr>
           <w:p>
             <w:pPr>
-              <w:spacing w:before="36" w:after="36"/>
+              <w:spacing w:before="20" w:after="60"/>
             </w:pPr>
             <w:r>
               <w:rPr>
@@ -4665,18 +4665,18 @@
     <w:tbl>
       <w:tblPr>
         <w:tblStyle w:val="a6"/>
-        <w:tblW w:w="8640" w:type="dxa"/>
         <w:tblInd w:w="0" w:type="dxa"/>
-        <w:tblBorders>
-          <w:top w:val="single" w:sz="4" w:space="0" w:color="000000"/>
-          <w:left w:val="single" w:sz="4" w:space="0" w:color="000000"/>
-          <w:bottom w:val="single" w:sz="4" w:space="0" w:color="000000"/>
-          <w:right w:val="single" w:sz="4" w:space="0" w:color="000000"/>
-          <w:insideH w:val="single" w:sz="4" w:space="0" w:color="000000"/>
-          <w:insideV w:val="single" w:sz="4" w:space="0" w:color="000000"/>
-        </w:tblBorders>
         <w:tblLayout w:type="fixed"/>
         <w:tblLook w:val="0000" w:firstRow="0" w:lastRow="0" w:firstColumn="0" w:lastColumn="0" w:noHBand="0" w:noVBand="0"/>
+        <w:tblBorders>
+          <w:top w:val="single" w:sz="8" w:space="0" w:color="C8A000"/>
+          <w:left w:val="single" w:sz="8" w:space="0" w:color="C8A000"/>
+          <w:bottom w:val="single" w:sz="8" w:space="0" w:color="C8A000"/>
+          <w:right w:val="single" w:sz="8" w:space="0" w:color="C8A000"/>
+          <w:insideH w:val="none"/>
+          <w:insideV w:val="none"/>
+        </w:tblBorders>
+        <w:tblW w:w="5000" w:type="pct"/>
       </w:tblPr>
       <w:tblGrid>
         <w:gridCol w:w="8640"/>
@@ -4691,17 +4691,17 @@
               <w:bottom w:val="single" w:sz="4" w:space="0" w:color="C8A951"/>
               <w:right w:val="nil"/>
             </w:tcBorders>
+            <w:shd w:val="clear" w:color="auto" w:fill="1A1A2E"/>
             <w:tcMar>
-              <w:top w:w="100" w:type="dxa"/>
-              <w:left w:w="200" w:type="dxa"/>
-              <w:bottom w:w="100" w:type="dxa"/>
-              <w:right w:w="200" w:type="dxa"/>
+              <w:top w:w="160" w:type="dxa"/>
+              <w:left w:w="360" w:type="dxa"/>
+              <w:bottom w:w="160" w:type="dxa"/>
+              <w:right w:w="360" w:type="dxa"/>
             </w:tcMar>
-            <w:shd w:val="clear" w:color="auto" w:fill="1A1A2E"/>
           </w:tcPr>
           <w:p>
             <w:pPr>
-              <w:spacing w:before="60" w:after="60"/>
+              <w:spacing w:before="0" w:after="0"/>
             </w:pPr>
             <w:r>
               <w:rPr>
@@ -4727,15 +4727,15 @@
             </w:tcBorders>
             <w:shd w:val="clear" w:color="auto" w:fill="F5F5F0"/>
             <w:tcMar>
-              <w:top w:w="50" w:type="dxa"/>
+              <w:top w:w="80" w:type="dxa"/>
               <w:left w:w="200" w:type="dxa"/>
-              <w:bottom w:w="50" w:type="dxa"/>
+              <w:bottom w:w="80" w:type="dxa"/>
               <w:right w:w="200" w:type="dxa"/>
             </w:tcMar>
           </w:tcPr>
           <w:p>
             <w:pPr>
-              <w:spacing w:before="36" w:after="36"/>
+              <w:spacing w:before="20" w:after="60"/>
             </w:pPr>
             <w:r>
               <w:rPr>
@@ -4761,15 +4761,15 @@
             </w:tcBorders>
             <w:shd w:val="clear" w:color="auto" w:fill="F5F5F0"/>
             <w:tcMar>
-              <w:top w:w="50" w:type="dxa"/>
+              <w:top w:w="80" w:type="dxa"/>
               <w:left w:w="200" w:type="dxa"/>
-              <w:bottom w:w="50" w:type="dxa"/>
+              <w:bottom w:w="80" w:type="dxa"/>
               <w:right w:w="200" w:type="dxa"/>
             </w:tcMar>
           </w:tcPr>
           <w:p>
             <w:pPr>
-              <w:spacing w:before="36" w:after="36"/>
+              <w:spacing w:before="20" w:after="60"/>
             </w:pPr>
             <w:r>
               <w:rPr>
@@ -4795,15 +4795,15 @@
             </w:tcBorders>
             <w:shd w:val="clear" w:color="auto" w:fill="F5F5F0"/>
             <w:tcMar>
-              <w:top w:w="50" w:type="dxa"/>
+              <w:top w:w="80" w:type="dxa"/>
               <w:left w:w="200" w:type="dxa"/>
-              <w:bottom w:w="50" w:type="dxa"/>
+              <w:bottom w:w="80" w:type="dxa"/>
               <w:right w:w="200" w:type="dxa"/>
             </w:tcMar>
           </w:tcPr>
           <w:p>
             <w:pPr>
-              <w:spacing w:before="36" w:after="36"/>
+              <w:spacing w:before="20" w:after="60"/>
             </w:pPr>
             <w:r>
               <w:rPr>
@@ -4829,15 +4829,15 @@
             </w:tcBorders>
             <w:shd w:val="clear" w:color="auto" w:fill="F5F5F0"/>
             <w:tcMar>
-              <w:top w:w="50" w:type="dxa"/>
+              <w:top w:w="80" w:type="dxa"/>
               <w:left w:w="200" w:type="dxa"/>
-              <w:bottom w:w="50" w:type="dxa"/>
+              <w:bottom w:w="80" w:type="dxa"/>
               <w:right w:w="200" w:type="dxa"/>
             </w:tcMar>
           </w:tcPr>
           <w:p>
             <w:pPr>
-              <w:spacing w:before="36" w:after="36"/>
+              <w:spacing w:before="20" w:after="60"/>
             </w:pPr>
             <w:r>
               <w:rPr>
@@ -4863,15 +4863,15 @@
             </w:tcBorders>
             <w:shd w:val="clear" w:color="auto" w:fill="F5F5F0"/>
             <w:tcMar>
-              <w:top w:w="50" w:type="dxa"/>
+              <w:top w:w="80" w:type="dxa"/>
               <w:left w:w="200" w:type="dxa"/>
-              <w:bottom w:w="50" w:type="dxa"/>
+              <w:bottom w:w="80" w:type="dxa"/>
               <w:right w:w="200" w:type="dxa"/>
             </w:tcMar>
           </w:tcPr>
           <w:p>
             <w:pPr>
-              <w:spacing w:before="36" w:after="36"/>
+              <w:spacing w:before="20" w:after="60"/>
             </w:pPr>
             <w:r>
               <w:rPr>
@@ -4897,15 +4897,15 @@
             </w:tcBorders>
             <w:shd w:val="clear" w:color="auto" w:fill="F5F5F0"/>
             <w:tcMar>
-              <w:top w:w="50" w:type="dxa"/>
+              <w:top w:w="80" w:type="dxa"/>
               <w:left w:w="200" w:type="dxa"/>
-              <w:bottom w:w="50" w:type="dxa"/>
+              <w:bottom w:w="80" w:type="dxa"/>
               <w:right w:w="200" w:type="dxa"/>
             </w:tcMar>
           </w:tcPr>
           <w:p>
             <w:pPr>
-              <w:spacing w:before="36" w:after="36"/>
+              <w:spacing w:before="20" w:after="60"/>
             </w:pPr>
             <w:r>
               <w:rPr>
@@ -4931,15 +4931,15 @@
             </w:tcBorders>
             <w:shd w:val="clear" w:color="auto" w:fill="F5F5F0"/>
             <w:tcMar>
-              <w:top w:w="50" w:type="dxa"/>
+              <w:top w:w="80" w:type="dxa"/>
               <w:left w:w="200" w:type="dxa"/>
-              <w:bottom w:w="50" w:type="dxa"/>
+              <w:bottom w:w="80" w:type="dxa"/>
               <w:right w:w="200" w:type="dxa"/>
             </w:tcMar>
           </w:tcPr>
           <w:p>
             <w:pPr>
-              <w:spacing w:before="36" w:after="36"/>
+              <w:spacing w:before="20" w:after="60"/>
             </w:pPr>
             <w:r>
               <w:rPr>
@@ -4965,15 +4965,15 @@
             </w:tcBorders>
             <w:shd w:val="clear" w:color="auto" w:fill="F5F5F0"/>
             <w:tcMar>
-              <w:top w:w="50" w:type="dxa"/>
+              <w:top w:w="80" w:type="dxa"/>
               <w:left w:w="200" w:type="dxa"/>
-              <w:bottom w:w="50" w:type="dxa"/>
+              <w:bottom w:w="80" w:type="dxa"/>
               <w:right w:w="200" w:type="dxa"/>
             </w:tcMar>
           </w:tcPr>
           <w:p>
             <w:pPr>
-              <w:spacing w:before="36" w:after="36"/>
+              <w:spacing w:before="20" w:after="60"/>
             </w:pPr>
             <w:r>
               <w:rPr>
@@ -4999,15 +4999,15 @@
             </w:tcBorders>
             <w:shd w:val="clear" w:color="auto" w:fill="F5F5F0"/>
             <w:tcMar>
-              <w:top w:w="50" w:type="dxa"/>
+              <w:top w:w="80" w:type="dxa"/>
               <w:left w:w="200" w:type="dxa"/>
-              <w:bottom w:w="50" w:type="dxa"/>
+              <w:bottom w:w="80" w:type="dxa"/>
               <w:right w:w="200" w:type="dxa"/>
             </w:tcMar>
           </w:tcPr>
           <w:p>
             <w:pPr>
-              <w:spacing w:before="36" w:after="36"/>
+              <w:spacing w:before="20" w:after="60"/>
             </w:pPr>
             <w:r>
               <w:rPr>
@@ -5768,18 +5768,18 @@
     <w:tbl>
       <w:tblPr>
         <w:tblStyle w:val="a7"/>
-        <w:tblW w:w="8640" w:type="dxa"/>
         <w:tblInd w:w="0" w:type="dxa"/>
-        <w:tblBorders>
-          <w:top w:val="single" w:sz="4" w:space="0" w:color="000000"/>
-          <w:left w:val="single" w:sz="4" w:space="0" w:color="000000"/>
-          <w:bottom w:val="single" w:sz="4" w:space="0" w:color="000000"/>
-          <w:right w:val="single" w:sz="4" w:space="0" w:color="000000"/>
-          <w:insideH w:val="single" w:sz="4" w:space="0" w:color="000000"/>
-          <w:insideV w:val="single" w:sz="4" w:space="0" w:color="000000"/>
-        </w:tblBorders>
         <w:tblLayout w:type="fixed"/>
         <w:tblLook w:val="0000" w:firstRow="0" w:lastRow="0" w:firstColumn="0" w:lastColumn="0" w:noHBand="0" w:noVBand="0"/>
+        <w:tblBorders>
+          <w:top w:val="single" w:sz="8" w:space="0" w:color="C8A000"/>
+          <w:left w:val="single" w:sz="8" w:space="0" w:color="C8A000"/>
+          <w:bottom w:val="single" w:sz="8" w:space="0" w:color="C8A000"/>
+          <w:right w:val="single" w:sz="8" w:space="0" w:color="C8A000"/>
+          <w:insideH w:val="none"/>
+          <w:insideV w:val="none"/>
+        </w:tblBorders>
+        <w:tblW w:w="5000" w:type="pct"/>
       </w:tblPr>
       <w:tblGrid>
         <w:gridCol w:w="8640"/>
@@ -5794,17 +5794,17 @@
               <w:bottom w:val="single" w:sz="4" w:space="0" w:color="C8A951"/>
               <w:right w:val="nil"/>
             </w:tcBorders>
+            <w:shd w:val="clear" w:color="auto" w:fill="1A1A2E"/>
             <w:tcMar>
-              <w:top w:w="100" w:type="dxa"/>
-              <w:left w:w="200" w:type="dxa"/>
-              <w:bottom w:w="100" w:type="dxa"/>
-              <w:right w:w="200" w:type="dxa"/>
+              <w:top w:w="160" w:type="dxa"/>
+              <w:left w:w="360" w:type="dxa"/>
+              <w:bottom w:w="160" w:type="dxa"/>
+              <w:right w:w="360" w:type="dxa"/>
             </w:tcMar>
-            <w:shd w:val="clear" w:color="auto" w:fill="1A1A2E"/>
           </w:tcPr>
           <w:p>
             <w:pPr>
-              <w:spacing w:before="60" w:after="60"/>
+              <w:spacing w:before="0" w:after="0"/>
             </w:pPr>
             <w:r>
               <w:rPr>
@@ -5830,15 +5830,15 @@
             </w:tcBorders>
             <w:shd w:val="clear" w:color="auto" w:fill="F5F5F0"/>
             <w:tcMar>
-              <w:top w:w="50" w:type="dxa"/>
+              <w:top w:w="80" w:type="dxa"/>
               <w:left w:w="200" w:type="dxa"/>
-              <w:bottom w:w="50" w:type="dxa"/>
+              <w:bottom w:w="80" w:type="dxa"/>
               <w:right w:w="200" w:type="dxa"/>
             </w:tcMar>
           </w:tcPr>
           <w:p>
             <w:pPr>
-              <w:spacing w:before="36" w:after="36"/>
+              <w:spacing w:before="20" w:after="60"/>
             </w:pPr>
             <w:r>
               <w:rPr>
@@ -5895,15 +5895,15 @@
             </w:tcBorders>
             <w:shd w:val="clear" w:color="auto" w:fill="F5F5F0"/>
             <w:tcMar>
-              <w:top w:w="50" w:type="dxa"/>
+              <w:top w:w="80" w:type="dxa"/>
               <w:left w:w="200" w:type="dxa"/>
-              <w:bottom w:w="50" w:type="dxa"/>
+              <w:bottom w:w="80" w:type="dxa"/>
               <w:right w:w="200" w:type="dxa"/>
             </w:tcMar>
           </w:tcPr>
           <w:p>
             <w:pPr>
-              <w:spacing w:before="36" w:after="36"/>
+              <w:spacing w:before="20" w:after="60"/>
             </w:pPr>
             <w:r>
               <w:rPr>
@@ -5929,15 +5929,15 @@
             </w:tcBorders>
             <w:shd w:val="clear" w:color="auto" w:fill="F5F5F0"/>
             <w:tcMar>
-              <w:top w:w="50" w:type="dxa"/>
+              <w:top w:w="80" w:type="dxa"/>
               <w:left w:w="200" w:type="dxa"/>
-              <w:bottom w:w="50" w:type="dxa"/>
+              <w:bottom w:w="80" w:type="dxa"/>
               <w:right w:w="200" w:type="dxa"/>
             </w:tcMar>
           </w:tcPr>
           <w:p>
             <w:pPr>
-              <w:spacing w:before="36" w:after="36"/>
+              <w:spacing w:before="20" w:after="60"/>
             </w:pPr>
             <w:r>
               <w:rPr>
@@ -5963,15 +5963,15 @@
             </w:tcBorders>
             <w:shd w:val="clear" w:color="auto" w:fill="F5F5F0"/>
             <w:tcMar>
-              <w:top w:w="50" w:type="dxa"/>
+              <w:top w:w="80" w:type="dxa"/>
               <w:left w:w="200" w:type="dxa"/>
-              <w:bottom w:w="50" w:type="dxa"/>
+              <w:bottom w:w="80" w:type="dxa"/>
               <w:right w:w="200" w:type="dxa"/>
             </w:tcMar>
           </w:tcPr>
           <w:p>
             <w:pPr>
-              <w:spacing w:before="36" w:after="36"/>
+              <w:spacing w:before="20" w:after="60"/>
             </w:pPr>
             <w:r>
               <w:rPr>
@@ -5997,15 +5997,15 @@
             </w:tcBorders>
             <w:shd w:val="clear" w:color="auto" w:fill="F5F5F0"/>
             <w:tcMar>
-              <w:top w:w="50" w:type="dxa"/>
+              <w:top w:w="80" w:type="dxa"/>
               <w:left w:w="200" w:type="dxa"/>
-              <w:bottom w:w="50" w:type="dxa"/>
+              <w:bottom w:w="80" w:type="dxa"/>
               <w:right w:w="200" w:type="dxa"/>
             </w:tcMar>
           </w:tcPr>
           <w:p>
             <w:pPr>
-              <w:spacing w:before="36" w:after="36"/>
+              <w:spacing w:before="20" w:after="60"/>
             </w:pPr>
             <w:r>
               <w:rPr>
@@ -6031,15 +6031,15 @@
             </w:tcBorders>
             <w:shd w:val="clear" w:color="auto" w:fill="F5F5F0"/>
             <w:tcMar>
-              <w:top w:w="50" w:type="dxa"/>
+              <w:top w:w="80" w:type="dxa"/>
               <w:left w:w="200" w:type="dxa"/>
-              <w:bottom w:w="50" w:type="dxa"/>
+              <w:bottom w:w="80" w:type="dxa"/>
               <w:right w:w="200" w:type="dxa"/>
             </w:tcMar>
           </w:tcPr>
           <w:p>
             <w:pPr>
-              <w:spacing w:before="36" w:after="36"/>
+              <w:spacing w:before="20" w:after="60"/>
             </w:pPr>
             <w:r>
               <w:rPr>
@@ -6235,18 +6235,18 @@
     <w:tbl>
       <w:tblPr>
         <w:tblStyle w:val="a8"/>
-        <w:tblW w:w="8640" w:type="dxa"/>
         <w:tblInd w:w="0" w:type="dxa"/>
-        <w:tblBorders>
-          <w:top w:val="single" w:sz="4" w:space="0" w:color="000000"/>
-          <w:left w:val="single" w:sz="4" w:space="0" w:color="000000"/>
-          <w:bottom w:val="single" w:sz="4" w:space="0" w:color="000000"/>
-          <w:right w:val="single" w:sz="4" w:space="0" w:color="000000"/>
-          <w:insideH w:val="single" w:sz="4" w:space="0" w:color="000000"/>
-          <w:insideV w:val="single" w:sz="4" w:space="0" w:color="000000"/>
-        </w:tblBorders>
         <w:tblLayout w:type="fixed"/>
         <w:tblLook w:val="0000" w:firstRow="0" w:lastRow="0" w:firstColumn="0" w:lastColumn="0" w:noHBand="0" w:noVBand="0"/>
+        <w:tblBorders>
+          <w:top w:val="single" w:sz="8" w:space="0" w:color="C8A000"/>
+          <w:left w:val="single" w:sz="8" w:space="0" w:color="C8A000"/>
+          <w:bottom w:val="single" w:sz="8" w:space="0" w:color="C8A000"/>
+          <w:right w:val="single" w:sz="8" w:space="0" w:color="C8A000"/>
+          <w:insideH w:val="none"/>
+          <w:insideV w:val="none"/>
+        </w:tblBorders>
+        <w:tblW w:w="5000" w:type="pct"/>
       </w:tblPr>
       <w:tblGrid>
         <w:gridCol w:w="8640"/>
@@ -6261,17 +6261,17 @@
               <w:bottom w:val="single" w:sz="4" w:space="0" w:color="C8A951"/>
               <w:right w:val="nil"/>
             </w:tcBorders>
+            <w:shd w:val="clear" w:color="auto" w:fill="1A1A2E"/>
             <w:tcMar>
-              <w:top w:w="100" w:type="dxa"/>
-              <w:left w:w="200" w:type="dxa"/>
-              <w:bottom w:w="100" w:type="dxa"/>
-              <w:right w:w="200" w:type="dxa"/>
+              <w:top w:w="160" w:type="dxa"/>
+              <w:left w:w="360" w:type="dxa"/>
+              <w:bottom w:w="160" w:type="dxa"/>
+              <w:right w:w="360" w:type="dxa"/>
             </w:tcMar>
-            <w:shd w:val="clear" w:color="auto" w:fill="1A1A2E"/>
           </w:tcPr>
           <w:p>
             <w:pPr>
-              <w:spacing w:before="60" w:after="60"/>
+              <w:spacing w:before="0" w:after="0"/>
             </w:pPr>
             <w:r>
               <w:rPr>
@@ -6297,15 +6297,15 @@
             </w:tcBorders>
             <w:shd w:val="clear" w:color="auto" w:fill="F5F5F0"/>
             <w:tcMar>
-              <w:top w:w="50" w:type="dxa"/>
+              <w:top w:w="80" w:type="dxa"/>
               <w:left w:w="200" w:type="dxa"/>
-              <w:bottom w:w="50" w:type="dxa"/>
+              <w:bottom w:w="80" w:type="dxa"/>
               <w:right w:w="200" w:type="dxa"/>
             </w:tcMar>
           </w:tcPr>
           <w:p>
             <w:pPr>
-              <w:spacing w:before="36" w:after="36"/>
+              <w:spacing w:before="20" w:after="60"/>
             </w:pPr>
             <w:r>
               <w:rPr>
@@ -6331,15 +6331,15 @@
             </w:tcBorders>
             <w:shd w:val="clear" w:color="auto" w:fill="F5F5F0"/>
             <w:tcMar>
-              <w:top w:w="50" w:type="dxa"/>
+              <w:top w:w="80" w:type="dxa"/>
               <w:left w:w="200" w:type="dxa"/>
-              <w:bottom w:w="50" w:type="dxa"/>
+              <w:bottom w:w="80" w:type="dxa"/>
               <w:right w:w="200" w:type="dxa"/>
             </w:tcMar>
           </w:tcPr>
           <w:p>
             <w:pPr>
-              <w:spacing w:before="36" w:after="36"/>
+              <w:spacing w:before="20" w:after="60"/>
             </w:pPr>
             <w:r>
               <w:rPr>
@@ -6365,15 +6365,15 @@
             </w:tcBorders>
             <w:shd w:val="clear" w:color="auto" w:fill="F5F5F0"/>
             <w:tcMar>
-              <w:top w:w="50" w:type="dxa"/>
+              <w:top w:w="80" w:type="dxa"/>
               <w:left w:w="200" w:type="dxa"/>
-              <w:bottom w:w="50" w:type="dxa"/>
+              <w:bottom w:w="80" w:type="dxa"/>
               <w:right w:w="200" w:type="dxa"/>
             </w:tcMar>
           </w:tcPr>
           <w:p>
             <w:pPr>
-              <w:spacing w:before="36" w:after="36"/>
+              <w:spacing w:before="20" w:after="60"/>
             </w:pPr>
             <w:r>
               <w:rPr>
@@ -6399,15 +6399,15 @@
             </w:tcBorders>
             <w:shd w:val="clear" w:color="auto" w:fill="F5F5F0"/>
             <w:tcMar>
-              <w:top w:w="50" w:type="dxa"/>
+              <w:top w:w="80" w:type="dxa"/>
               <w:left w:w="200" w:type="dxa"/>
-              <w:bottom w:w="50" w:type="dxa"/>
+              <w:bottom w:w="80" w:type="dxa"/>
               <w:right w:w="200" w:type="dxa"/>
             </w:tcMar>
           </w:tcPr>
           <w:p>
             <w:pPr>
-              <w:spacing w:before="36" w:after="36"/>
+              <w:spacing w:before="20" w:after="60"/>
             </w:pPr>
             <w:r>
               <w:rPr>
@@ -6433,15 +6433,15 @@
             </w:tcBorders>
             <w:shd w:val="clear" w:color="auto" w:fill="F5F5F0"/>
             <w:tcMar>
-              <w:top w:w="50" w:type="dxa"/>
+              <w:top w:w="80" w:type="dxa"/>
               <w:left w:w="200" w:type="dxa"/>
-              <w:bottom w:w="50" w:type="dxa"/>
+              <w:bottom w:w="80" w:type="dxa"/>
               <w:right w:w="200" w:type="dxa"/>
             </w:tcMar>
           </w:tcPr>
           <w:p>
             <w:pPr>
-              <w:spacing w:before="36" w:after="36"/>
+              <w:spacing w:before="20" w:after="60"/>
             </w:pPr>
             <w:r>
               <w:rPr>
@@ -8223,18 +8223,18 @@
     <w:tbl>
       <w:tblPr>
         <w:tblStyle w:val="a9"/>
-        <w:tblW w:w="8640" w:type="dxa"/>
         <w:tblInd w:w="0" w:type="dxa"/>
-        <w:tblBorders>
-          <w:top w:val="single" w:sz="4" w:space="0" w:color="000000"/>
-          <w:left w:val="single" w:sz="4" w:space="0" w:color="000000"/>
-          <w:bottom w:val="single" w:sz="4" w:space="0" w:color="000000"/>
-          <w:right w:val="single" w:sz="4" w:space="0" w:color="000000"/>
-          <w:insideH w:val="single" w:sz="4" w:space="0" w:color="000000"/>
-          <w:insideV w:val="single" w:sz="4" w:space="0" w:color="000000"/>
-        </w:tblBorders>
         <w:tblLayout w:type="fixed"/>
         <w:tblLook w:val="0000" w:firstRow="0" w:lastRow="0" w:firstColumn="0" w:lastColumn="0" w:noHBand="0" w:noVBand="0"/>
+        <w:tblBorders>
+          <w:top w:val="single" w:sz="8" w:space="0" w:color="C8A000"/>
+          <w:left w:val="single" w:sz="8" w:space="0" w:color="C8A000"/>
+          <w:bottom w:val="single" w:sz="8" w:space="0" w:color="C8A000"/>
+          <w:right w:val="single" w:sz="8" w:space="0" w:color="C8A000"/>
+          <w:insideH w:val="none"/>
+          <w:insideV w:val="none"/>
+        </w:tblBorders>
+        <w:tblW w:w="5000" w:type="pct"/>
       </w:tblPr>
       <w:tblGrid>
         <w:gridCol w:w="8640"/>
@@ -8249,17 +8249,17 @@
               <w:bottom w:val="single" w:sz="4" w:space="0" w:color="C8A951"/>
               <w:right w:val="nil"/>
             </w:tcBorders>
+            <w:shd w:val="clear" w:color="auto" w:fill="1A1A2E"/>
             <w:tcMar>
-              <w:top w:w="100" w:type="dxa"/>
-              <w:left w:w="200" w:type="dxa"/>
-              <w:bottom w:w="100" w:type="dxa"/>
-              <w:right w:w="200" w:type="dxa"/>
+              <w:top w:w="160" w:type="dxa"/>
+              <w:left w:w="360" w:type="dxa"/>
+              <w:bottom w:w="160" w:type="dxa"/>
+              <w:right w:w="360" w:type="dxa"/>
             </w:tcMar>
-            <w:shd w:val="clear" w:color="auto" w:fill="1A1A2E"/>
           </w:tcPr>
           <w:p>
             <w:pPr>
-              <w:spacing w:before="60" w:after="60"/>
+              <w:spacing w:before="0" w:after="0"/>
             </w:pPr>
             <w:r>
               <w:rPr>
@@ -8285,15 +8285,15 @@
             </w:tcBorders>
             <w:shd w:val="clear" w:color="auto" w:fill="F5F5F0"/>
             <w:tcMar>
-              <w:top w:w="50" w:type="dxa"/>
+              <w:top w:w="80" w:type="dxa"/>
               <w:left w:w="200" w:type="dxa"/>
-              <w:bottom w:w="50" w:type="dxa"/>
+              <w:bottom w:w="80" w:type="dxa"/>
               <w:right w:w="200" w:type="dxa"/>
             </w:tcMar>
           </w:tcPr>
           <w:p>
             <w:pPr>
-              <w:spacing w:before="36" w:after="36"/>
+              <w:spacing w:before="20" w:after="60"/>
             </w:pPr>
             <w:r>
               <w:rPr>
@@ -8319,15 +8319,15 @@
             </w:tcBorders>
             <w:shd w:val="clear" w:color="auto" w:fill="F5F5F0"/>
             <w:tcMar>
-              <w:top w:w="50" w:type="dxa"/>
+              <w:top w:w="80" w:type="dxa"/>
               <w:left w:w="200" w:type="dxa"/>
-              <w:bottom w:w="50" w:type="dxa"/>
+              <w:bottom w:w="80" w:type="dxa"/>
               <w:right w:w="200" w:type="dxa"/>
             </w:tcMar>
           </w:tcPr>
           <w:p>
             <w:pPr>
-              <w:spacing w:before="36" w:after="36"/>
+              <w:spacing w:before="20" w:after="60"/>
             </w:pPr>
             <w:r>
               <w:rPr>
@@ -8353,15 +8353,15 @@
             </w:tcBorders>
             <w:shd w:val="clear" w:color="auto" w:fill="F5F5F0"/>
             <w:tcMar>
-              <w:top w:w="50" w:type="dxa"/>
+              <w:top w:w="80" w:type="dxa"/>
               <w:left w:w="200" w:type="dxa"/>
-              <w:bottom w:w="50" w:type="dxa"/>
+              <w:bottom w:w="80" w:type="dxa"/>
               <w:right w:w="200" w:type="dxa"/>
             </w:tcMar>
           </w:tcPr>
           <w:p>
             <w:pPr>
-              <w:spacing w:before="36" w:after="36"/>
+              <w:spacing w:before="20" w:after="60"/>
             </w:pPr>
             <w:r>
               <w:rPr>
@@ -8387,15 +8387,15 @@
             </w:tcBorders>
             <w:shd w:val="clear" w:color="auto" w:fill="F5F5F0"/>
             <w:tcMar>
-              <w:top w:w="50" w:type="dxa"/>
+              <w:top w:w="80" w:type="dxa"/>
               <w:left w:w="200" w:type="dxa"/>
-              <w:bottom w:w="50" w:type="dxa"/>
+              <w:bottom w:w="80" w:type="dxa"/>
               <w:right w:w="200" w:type="dxa"/>
             </w:tcMar>
           </w:tcPr>
           <w:p>
             <w:pPr>
-              <w:spacing w:before="36" w:after="36"/>
+              <w:spacing w:before="20" w:after="60"/>
             </w:pPr>
             <w:r>
               <w:rPr>
@@ -8421,15 +8421,15 @@
             </w:tcBorders>
             <w:shd w:val="clear" w:color="auto" w:fill="F5F5F0"/>
             <w:tcMar>
-              <w:top w:w="50" w:type="dxa"/>
+              <w:top w:w="80" w:type="dxa"/>
               <w:left w:w="200" w:type="dxa"/>
-              <w:bottom w:w="50" w:type="dxa"/>
+              <w:bottom w:w="80" w:type="dxa"/>
               <w:right w:w="200" w:type="dxa"/>
             </w:tcMar>
           </w:tcPr>
           <w:p>
             <w:pPr>
-              <w:spacing w:before="36" w:after="36"/>
+              <w:spacing w:before="20" w:after="60"/>
             </w:pPr>
             <w:r>
               <w:rPr>
@@ -8455,15 +8455,15 @@
             </w:tcBorders>
             <w:shd w:val="clear" w:color="auto" w:fill="F5F5F0"/>
             <w:tcMar>
-              <w:top w:w="50" w:type="dxa"/>
+              <w:top w:w="80" w:type="dxa"/>
               <w:left w:w="200" w:type="dxa"/>
-              <w:bottom w:w="50" w:type="dxa"/>
+              <w:bottom w:w="80" w:type="dxa"/>
               <w:right w:w="200" w:type="dxa"/>
             </w:tcMar>
           </w:tcPr>
           <w:p>
             <w:pPr>
-              <w:spacing w:before="36" w:after="36"/>
+              <w:spacing w:before="20" w:after="60"/>
             </w:pPr>
             <w:r>
               <w:rPr>
@@ -8709,18 +8709,18 @@
     <w:tbl>
       <w:tblPr>
         <w:tblStyle w:val="aa"/>
-        <w:tblW w:w="8640" w:type="dxa"/>
         <w:tblInd w:w="0" w:type="dxa"/>
-        <w:tblBorders>
-          <w:top w:val="single" w:sz="4" w:space="0" w:color="000000"/>
-          <w:left w:val="single" w:sz="4" w:space="0" w:color="000000"/>
-          <w:bottom w:val="single" w:sz="4" w:space="0" w:color="000000"/>
-          <w:right w:val="single" w:sz="4" w:space="0" w:color="000000"/>
-          <w:insideH w:val="single" w:sz="4" w:space="0" w:color="000000"/>
-          <w:insideV w:val="single" w:sz="4" w:space="0" w:color="000000"/>
-        </w:tblBorders>
         <w:tblLayout w:type="fixed"/>
         <w:tblLook w:val="0000" w:firstRow="0" w:lastRow="0" w:firstColumn="0" w:lastColumn="0" w:noHBand="0" w:noVBand="0"/>
+        <w:tblBorders>
+          <w:top w:val="single" w:sz="8" w:space="0" w:color="C8A000"/>
+          <w:left w:val="single" w:sz="8" w:space="0" w:color="C8A000"/>
+          <w:bottom w:val="single" w:sz="8" w:space="0" w:color="C8A000"/>
+          <w:right w:val="single" w:sz="8" w:space="0" w:color="C8A000"/>
+          <w:insideH w:val="none"/>
+          <w:insideV w:val="none"/>
+        </w:tblBorders>
+        <w:tblW w:w="5000" w:type="pct"/>
       </w:tblPr>
       <w:tblGrid>
         <w:gridCol w:w="8640"/>
@@ -8735,17 +8735,17 @@
               <w:bottom w:val="single" w:sz="4" w:space="0" w:color="C8A951"/>
               <w:right w:val="nil"/>
             </w:tcBorders>
+            <w:shd w:val="clear" w:color="auto" w:fill="1A1A2E"/>
             <w:tcMar>
-              <w:top w:w="100" w:type="dxa"/>
-              <w:left w:w="200" w:type="dxa"/>
-              <w:bottom w:w="100" w:type="dxa"/>
-              <w:right w:w="200" w:type="dxa"/>
+              <w:top w:w="160" w:type="dxa"/>
+              <w:left w:w="360" w:type="dxa"/>
+              <w:bottom w:w="160" w:type="dxa"/>
+              <w:right w:w="360" w:type="dxa"/>
             </w:tcMar>
-            <w:shd w:val="clear" w:color="auto" w:fill="1A1A2E"/>
           </w:tcPr>
           <w:p>
             <w:pPr>
-              <w:spacing w:before="60" w:after="60"/>
+              <w:spacing w:before="0" w:after="0"/>
             </w:pPr>
             <w:r>
               <w:rPr>
@@ -8771,15 +8771,15 @@
             </w:tcBorders>
             <w:shd w:val="clear" w:color="auto" w:fill="F5F5F0"/>
             <w:tcMar>
-              <w:top w:w="50" w:type="dxa"/>
+              <w:top w:w="80" w:type="dxa"/>
               <w:left w:w="200" w:type="dxa"/>
-              <w:bottom w:w="50" w:type="dxa"/>
+              <w:bottom w:w="80" w:type="dxa"/>
               <w:right w:w="200" w:type="dxa"/>
             </w:tcMar>
           </w:tcPr>
           <w:p>
             <w:pPr>
-              <w:spacing w:before="36" w:after="36"/>
+              <w:spacing w:before="20" w:after="60"/>
             </w:pPr>
             <w:r>
               <w:rPr>
@@ -8805,15 +8805,15 @@
             </w:tcBorders>
             <w:shd w:val="clear" w:color="auto" w:fill="F5F5F0"/>
             <w:tcMar>
-              <w:top w:w="50" w:type="dxa"/>
+              <w:top w:w="80" w:type="dxa"/>
               <w:left w:w="200" w:type="dxa"/>
-              <w:bottom w:w="50" w:type="dxa"/>
+              <w:bottom w:w="80" w:type="dxa"/>
               <w:right w:w="200" w:type="dxa"/>
             </w:tcMar>
           </w:tcPr>
           <w:p>
             <w:pPr>
-              <w:spacing w:before="36" w:after="36"/>
+              <w:spacing w:before="20" w:after="60"/>
             </w:pPr>
             <w:r>
               <w:rPr>
@@ -8839,15 +8839,15 @@
             </w:tcBorders>
             <w:shd w:val="clear" w:color="auto" w:fill="F5F5F0"/>
             <w:tcMar>
-              <w:top w:w="50" w:type="dxa"/>
+              <w:top w:w="80" w:type="dxa"/>
               <w:left w:w="200" w:type="dxa"/>
-              <w:bottom w:w="50" w:type="dxa"/>
+              <w:bottom w:w="80" w:type="dxa"/>
               <w:right w:w="200" w:type="dxa"/>
             </w:tcMar>
           </w:tcPr>
           <w:p>
             <w:pPr>
-              <w:spacing w:before="36" w:after="36"/>
+              <w:spacing w:before="20" w:after="60"/>
             </w:pPr>
             <w:r>
               <w:rPr>
@@ -8873,15 +8873,15 @@
             </w:tcBorders>
             <w:shd w:val="clear" w:color="auto" w:fill="F5F5F0"/>
             <w:tcMar>
-              <w:top w:w="50" w:type="dxa"/>
+              <w:top w:w="80" w:type="dxa"/>
               <w:left w:w="200" w:type="dxa"/>
-              <w:bottom w:w="50" w:type="dxa"/>
+              <w:bottom w:w="80" w:type="dxa"/>
               <w:right w:w="200" w:type="dxa"/>
             </w:tcMar>
           </w:tcPr>
           <w:p>
             <w:pPr>
-              <w:spacing w:before="36" w:after="36"/>
+              <w:spacing w:before="20" w:after="60"/>
             </w:pPr>
             <w:r>
               <w:rPr>
@@ -8907,15 +8907,15 @@
             </w:tcBorders>
             <w:shd w:val="clear" w:color="auto" w:fill="F5F5F0"/>
             <w:tcMar>
-              <w:top w:w="50" w:type="dxa"/>
+              <w:top w:w="80" w:type="dxa"/>
               <w:left w:w="200" w:type="dxa"/>
-              <w:bottom w:w="50" w:type="dxa"/>
+              <w:bottom w:w="80" w:type="dxa"/>
               <w:right w:w="200" w:type="dxa"/>
             </w:tcMar>
           </w:tcPr>
           <w:p>
             <w:pPr>
-              <w:spacing w:before="36" w:after="36"/>
+              <w:spacing w:before="20" w:after="60"/>
             </w:pPr>
             <w:r>
               <w:rPr>
@@ -9535,18 +9535,18 @@
     <w:tbl>
       <w:tblPr>
         <w:tblStyle w:val="ab"/>
-        <w:tblW w:w="8640" w:type="dxa"/>
         <w:tblInd w:w="0" w:type="dxa"/>
-        <w:tblBorders>
-          <w:top w:val="single" w:sz="4" w:space="0" w:color="000000"/>
-          <w:left w:val="single" w:sz="4" w:space="0" w:color="000000"/>
-          <w:bottom w:val="single" w:sz="4" w:space="0" w:color="000000"/>
-          <w:right w:val="single" w:sz="4" w:space="0" w:color="000000"/>
-          <w:insideH w:val="single" w:sz="4" w:space="0" w:color="000000"/>
-          <w:insideV w:val="single" w:sz="4" w:space="0" w:color="000000"/>
-        </w:tblBorders>
         <w:tblLayout w:type="fixed"/>
         <w:tblLook w:val="0000" w:firstRow="0" w:lastRow="0" w:firstColumn="0" w:lastColumn="0" w:noHBand="0" w:noVBand="0"/>
+        <w:tblBorders>
+          <w:top w:val="single" w:sz="8" w:space="0" w:color="C8A000"/>
+          <w:left w:val="single" w:sz="8" w:space="0" w:color="C8A000"/>
+          <w:bottom w:val="single" w:sz="8" w:space="0" w:color="C8A000"/>
+          <w:right w:val="single" w:sz="8" w:space="0" w:color="C8A000"/>
+          <w:insideH w:val="none"/>
+          <w:insideV w:val="none"/>
+        </w:tblBorders>
+        <w:tblW w:w="5000" w:type="pct"/>
       </w:tblPr>
       <w:tblGrid>
         <w:gridCol w:w="8640"/>
@@ -9563,15 +9563,15 @@
             </w:tcBorders>
             <w:shd w:val="clear" w:color="auto" w:fill="252525"/>
             <w:tcMar>
-              <w:top w:w="100" w:type="dxa"/>
-              <w:left w:w="200" w:type="dxa"/>
-              <w:bottom w:w="100" w:type="dxa"/>
-              <w:right w:w="200" w:type="dxa"/>
+              <w:top w:w="160" w:type="dxa"/>
+              <w:left w:w="360" w:type="dxa"/>
+              <w:bottom w:w="160" w:type="dxa"/>
+              <w:right w:w="360" w:type="dxa"/>
             </w:tcMar>
           </w:tcPr>
           <w:p>
             <w:pPr>
-              <w:spacing w:before="60" w:after="60"/>
+              <w:spacing w:before="0" w:after="0"/>
             </w:pPr>
             <w:r>
               <w:rPr>
@@ -9597,15 +9597,15 @@
             </w:tcBorders>
             <w:shd w:val="clear" w:color="auto" w:fill="F5F5F0"/>
             <w:tcMar>
-              <w:top w:w="50" w:type="dxa"/>
+              <w:top w:w="80" w:type="dxa"/>
               <w:left w:w="200" w:type="dxa"/>
-              <w:bottom w:w="50" w:type="dxa"/>
+              <w:bottom w:w="80" w:type="dxa"/>
               <w:right w:w="200" w:type="dxa"/>
             </w:tcMar>
           </w:tcPr>
           <w:p>
             <w:pPr>
-              <w:spacing w:before="36" w:after="36"/>
+              <w:spacing w:before="20" w:after="60"/>
             </w:pPr>
             <w:r>
               <w:rPr>
@@ -9631,15 +9631,15 @@
             </w:tcBorders>
             <w:shd w:val="clear" w:color="auto" w:fill="F5F5F0"/>
             <w:tcMar>
-              <w:top w:w="50" w:type="dxa"/>
+              <w:top w:w="80" w:type="dxa"/>
               <w:left w:w="200" w:type="dxa"/>
-              <w:bottom w:w="50" w:type="dxa"/>
+              <w:bottom w:w="80" w:type="dxa"/>
               <w:right w:w="200" w:type="dxa"/>
             </w:tcMar>
           </w:tcPr>
           <w:p>
             <w:pPr>
-              <w:spacing w:before="36" w:after="36"/>
+              <w:spacing w:before="20" w:after="60"/>
             </w:pPr>
             <w:r>
               <w:rPr>
@@ -9683,15 +9683,15 @@
             </w:tcBorders>
             <w:shd w:val="clear" w:color="auto" w:fill="F5F5F0"/>
             <w:tcMar>
-              <w:top w:w="50" w:type="dxa"/>
+              <w:top w:w="80" w:type="dxa"/>
               <w:left w:w="200" w:type="dxa"/>
-              <w:bottom w:w="50" w:type="dxa"/>
+              <w:bottom w:w="80" w:type="dxa"/>
               <w:right w:w="200" w:type="dxa"/>
             </w:tcMar>
           </w:tcPr>
           <w:p>
             <w:pPr>
-              <w:spacing w:before="36" w:after="36"/>
+              <w:spacing w:before="20" w:after="60"/>
             </w:pPr>
             <w:r>
               <w:rPr>
@@ -9717,15 +9717,15 @@
             </w:tcBorders>
             <w:shd w:val="clear" w:color="auto" w:fill="F5F5F0"/>
             <w:tcMar>
-              <w:top w:w="50" w:type="dxa"/>
+              <w:top w:w="80" w:type="dxa"/>
               <w:left w:w="200" w:type="dxa"/>
-              <w:bottom w:w="50" w:type="dxa"/>
+              <w:bottom w:w="80" w:type="dxa"/>
               <w:right w:w="200" w:type="dxa"/>
             </w:tcMar>
           </w:tcPr>
           <w:p>
             <w:pPr>
-              <w:spacing w:before="36" w:after="36"/>
+              <w:spacing w:before="20" w:after="60"/>
             </w:pPr>
             <w:r>
               <w:rPr>
@@ -9982,18 +9982,18 @@
     <w:tbl>
       <w:tblPr>
         <w:tblStyle w:val="ac"/>
-        <w:tblW w:w="8640" w:type="dxa"/>
         <w:tblInd w:w="0" w:type="dxa"/>
-        <w:tblBorders>
-          <w:top w:val="single" w:sz="4" w:space="0" w:color="000000"/>
-          <w:left w:val="single" w:sz="4" w:space="0" w:color="000000"/>
-          <w:bottom w:val="single" w:sz="4" w:space="0" w:color="000000"/>
-          <w:right w:val="single" w:sz="4" w:space="0" w:color="000000"/>
-          <w:insideH w:val="single" w:sz="4" w:space="0" w:color="000000"/>
-          <w:insideV w:val="single" w:sz="4" w:space="0" w:color="000000"/>
-        </w:tblBorders>
         <w:tblLayout w:type="fixed"/>
         <w:tblLook w:val="0000" w:firstRow="0" w:lastRow="0" w:firstColumn="0" w:lastColumn="0" w:noHBand="0" w:noVBand="0"/>
+        <w:tblBorders>
+          <w:top w:val="single" w:sz="8" w:space="0" w:color="C8A000"/>
+          <w:left w:val="single" w:sz="8" w:space="0" w:color="C8A000"/>
+          <w:bottom w:val="single" w:sz="8" w:space="0" w:color="C8A000"/>
+          <w:right w:val="single" w:sz="8" w:space="0" w:color="C8A000"/>
+          <w:insideH w:val="none"/>
+          <w:insideV w:val="none"/>
+        </w:tblBorders>
+        <w:tblW w:w="5000" w:type="pct"/>
       </w:tblPr>
       <w:tblGrid>
         <w:gridCol w:w="8640"/>
@@ -10010,15 +10010,15 @@
             </w:tcBorders>
             <w:shd w:val="clear" w:color="auto" w:fill="252525"/>
             <w:tcMar>
-              <w:top w:w="100" w:type="dxa"/>
-              <w:left w:w="200" w:type="dxa"/>
-              <w:bottom w:w="100" w:type="dxa"/>
-              <w:right w:w="200" w:type="dxa"/>
+              <w:top w:w="160" w:type="dxa"/>
+              <w:left w:w="360" w:type="dxa"/>
+              <w:bottom w:w="160" w:type="dxa"/>
+              <w:right w:w="360" w:type="dxa"/>
             </w:tcMar>
           </w:tcPr>
           <w:p>
             <w:pPr>
-              <w:spacing w:before="60" w:after="60"/>
+              <w:spacing w:before="0" w:after="0"/>
             </w:pPr>
             <w:r>
               <w:rPr>
@@ -10044,15 +10044,15 @@
             </w:tcBorders>
             <w:shd w:val="clear" w:color="auto" w:fill="F5F5F0"/>
             <w:tcMar>
-              <w:top w:w="50" w:type="dxa"/>
+              <w:top w:w="80" w:type="dxa"/>
               <w:left w:w="200" w:type="dxa"/>
-              <w:bottom w:w="50" w:type="dxa"/>
+              <w:bottom w:w="80" w:type="dxa"/>
               <w:right w:w="200" w:type="dxa"/>
             </w:tcMar>
           </w:tcPr>
           <w:p>
             <w:pPr>
-              <w:spacing w:before="36" w:after="36"/>
+              <w:spacing w:before="20" w:after="60"/>
             </w:pPr>
             <w:r>
               <w:rPr>
@@ -10078,15 +10078,15 @@
             </w:tcBorders>
             <w:shd w:val="clear" w:color="auto" w:fill="F5F5F0"/>
             <w:tcMar>
-              <w:top w:w="50" w:type="dxa"/>
+              <w:top w:w="80" w:type="dxa"/>
               <w:left w:w="200" w:type="dxa"/>
-              <w:bottom w:w="50" w:type="dxa"/>
+              <w:bottom w:w="80" w:type="dxa"/>
               <w:right w:w="200" w:type="dxa"/>
             </w:tcMar>
           </w:tcPr>
           <w:p>
             <w:pPr>
-              <w:spacing w:before="36" w:after="36"/>
+              <w:spacing w:before="20" w:after="60"/>
             </w:pPr>
             <w:r>
               <w:rPr>
@@ -10112,15 +10112,15 @@
             </w:tcBorders>
             <w:shd w:val="clear" w:color="auto" w:fill="F5F5F0"/>
             <w:tcMar>
-              <w:top w:w="50" w:type="dxa"/>
+              <w:top w:w="80" w:type="dxa"/>
               <w:left w:w="200" w:type="dxa"/>
-              <w:bottom w:w="50" w:type="dxa"/>
+              <w:bottom w:w="80" w:type="dxa"/>
               <w:right w:w="200" w:type="dxa"/>
             </w:tcMar>
           </w:tcPr>
           <w:p>
             <w:pPr>
-              <w:spacing w:before="36" w:after="36"/>
+              <w:spacing w:before="20" w:after="60"/>
             </w:pPr>
             <w:r>
               <w:rPr>
@@ -10146,15 +10146,15 @@
             </w:tcBorders>
             <w:shd w:val="clear" w:color="auto" w:fill="F5F5F0"/>
             <w:tcMar>
-              <w:top w:w="50" w:type="dxa"/>
+              <w:top w:w="80" w:type="dxa"/>
               <w:left w:w="200" w:type="dxa"/>
-              <w:bottom w:w="50" w:type="dxa"/>
+              <w:bottom w:w="80" w:type="dxa"/>
               <w:right w:w="200" w:type="dxa"/>
             </w:tcMar>
           </w:tcPr>
           <w:p>
             <w:pPr>
-              <w:spacing w:before="36" w:after="36"/>
+              <w:spacing w:before="20" w:after="60"/>
             </w:pPr>
             <w:r>
               <w:rPr>
@@ -10180,15 +10180,15 @@
             </w:tcBorders>
             <w:shd w:val="clear" w:color="auto" w:fill="F5F5F0"/>
             <w:tcMar>
-              <w:top w:w="50" w:type="dxa"/>
+              <w:top w:w="80" w:type="dxa"/>
               <w:left w:w="200" w:type="dxa"/>
-              <w:bottom w:w="50" w:type="dxa"/>
+              <w:bottom w:w="80" w:type="dxa"/>
               <w:right w:w="200" w:type="dxa"/>
             </w:tcMar>
           </w:tcPr>
           <w:p>
             <w:pPr>
-              <w:spacing w:before="36" w:after="36"/>
+              <w:spacing w:before="20" w:after="60"/>
             </w:pPr>
             <w:r>
               <w:rPr>
@@ -10307,18 +10307,18 @@
     <w:tbl>
       <w:tblPr>
         <w:tblStyle w:val="ad"/>
-        <w:tblW w:w="8640" w:type="dxa"/>
         <w:tblInd w:w="0" w:type="dxa"/>
-        <w:tblBorders>
-          <w:top w:val="single" w:sz="4" w:space="0" w:color="000000"/>
-          <w:left w:val="single" w:sz="4" w:space="0" w:color="000000"/>
-          <w:bottom w:val="single" w:sz="4" w:space="0" w:color="000000"/>
-          <w:right w:val="single" w:sz="4" w:space="0" w:color="000000"/>
-          <w:insideH w:val="single" w:sz="4" w:space="0" w:color="000000"/>
-          <w:insideV w:val="single" w:sz="4" w:space="0" w:color="000000"/>
-        </w:tblBorders>
         <w:tblLayout w:type="fixed"/>
         <w:tblLook w:val="0000" w:firstRow="0" w:lastRow="0" w:firstColumn="0" w:lastColumn="0" w:noHBand="0" w:noVBand="0"/>
+        <w:tblBorders>
+          <w:top w:val="single" w:sz="8" w:space="0" w:color="C8A000"/>
+          <w:left w:val="single" w:sz="8" w:space="0" w:color="C8A000"/>
+          <w:bottom w:val="single" w:sz="8" w:space="0" w:color="C8A000"/>
+          <w:right w:val="single" w:sz="8" w:space="0" w:color="C8A000"/>
+          <w:insideH w:val="none"/>
+          <w:insideV w:val="none"/>
+        </w:tblBorders>
+        <w:tblW w:w="5000" w:type="pct"/>
       </w:tblPr>
       <w:tblGrid>
         <w:gridCol w:w="8640"/>
@@ -10333,17 +10333,17 @@
               <w:bottom w:val="single" w:sz="4" w:space="0" w:color="C8A951"/>
               <w:right w:val="nil"/>
             </w:tcBorders>
+            <w:shd w:val="clear" w:color="auto" w:fill="1A1A2E"/>
             <w:tcMar>
-              <w:top w:w="100" w:type="dxa"/>
-              <w:left w:w="200" w:type="dxa"/>
-              <w:bottom w:w="100" w:type="dxa"/>
-              <w:right w:w="200" w:type="dxa"/>
+              <w:top w:w="160" w:type="dxa"/>
+              <w:left w:w="360" w:type="dxa"/>
+              <w:bottom w:w="160" w:type="dxa"/>
+              <w:right w:w="360" w:type="dxa"/>
             </w:tcMar>
-            <w:shd w:val="clear" w:color="auto" w:fill="1A1A2E"/>
           </w:tcPr>
           <w:p>
             <w:pPr>
-              <w:spacing w:before="60" w:after="60"/>
+              <w:spacing w:before="0" w:after="0"/>
             </w:pPr>
             <w:r>
               <w:rPr>
@@ -10369,15 +10369,15 @@
             </w:tcBorders>
             <w:shd w:val="clear" w:color="auto" w:fill="F5F5F0"/>
             <w:tcMar>
-              <w:top w:w="50" w:type="dxa"/>
+              <w:top w:w="80" w:type="dxa"/>
               <w:left w:w="200" w:type="dxa"/>
-              <w:bottom w:w="50" w:type="dxa"/>
+              <w:bottom w:w="80" w:type="dxa"/>
               <w:right w:w="200" w:type="dxa"/>
             </w:tcMar>
           </w:tcPr>
           <w:p>
             <w:pPr>
-              <w:spacing w:before="36" w:after="36"/>
+              <w:spacing w:before="20" w:after="60"/>
             </w:pPr>
             <w:r>
               <w:rPr>
@@ -10403,15 +10403,15 @@
             </w:tcBorders>
             <w:shd w:val="clear" w:color="auto" w:fill="F5F5F0"/>
             <w:tcMar>
-              <w:top w:w="50" w:type="dxa"/>
+              <w:top w:w="80" w:type="dxa"/>
               <w:left w:w="200" w:type="dxa"/>
-              <w:bottom w:w="50" w:type="dxa"/>
+              <w:bottom w:w="80" w:type="dxa"/>
               <w:right w:w="200" w:type="dxa"/>
             </w:tcMar>
           </w:tcPr>
           <w:p>
             <w:pPr>
-              <w:spacing w:before="36" w:after="36"/>
+              <w:spacing w:before="20" w:after="60"/>
             </w:pPr>
             <w:r>
               <w:rPr>
@@ -10437,15 +10437,15 @@
             </w:tcBorders>
             <w:shd w:val="clear" w:color="auto" w:fill="F5F5F0"/>
             <w:tcMar>
-              <w:top w:w="50" w:type="dxa"/>
+              <w:top w:w="80" w:type="dxa"/>
               <w:left w:w="200" w:type="dxa"/>
-              <w:bottom w:w="50" w:type="dxa"/>
+              <w:bottom w:w="80" w:type="dxa"/>
               <w:right w:w="200" w:type="dxa"/>
             </w:tcMar>
           </w:tcPr>
           <w:p>
             <w:pPr>
-              <w:spacing w:before="36" w:after="36"/>
+              <w:spacing w:before="20" w:after="60"/>
             </w:pPr>
             <w:r>
               <w:rPr>
@@ -10489,15 +10489,15 @@
             </w:tcBorders>
             <w:shd w:val="clear" w:color="auto" w:fill="F5F5F0"/>
             <w:tcMar>
-              <w:top w:w="50" w:type="dxa"/>
+              <w:top w:w="80" w:type="dxa"/>
               <w:left w:w="200" w:type="dxa"/>
-              <w:bottom w:w="50" w:type="dxa"/>
+              <w:bottom w:w="80" w:type="dxa"/>
               <w:right w:w="200" w:type="dxa"/>
             </w:tcMar>
           </w:tcPr>
           <w:p>
             <w:pPr>
-              <w:spacing w:before="36" w:after="36"/>
+              <w:spacing w:before="20" w:after="60"/>
             </w:pPr>
             <w:r>
               <w:rPr>
@@ -10523,15 +10523,15 @@
             </w:tcBorders>
             <w:shd w:val="clear" w:color="auto" w:fill="F5F5F0"/>
             <w:tcMar>
-              <w:top w:w="50" w:type="dxa"/>
+              <w:top w:w="80" w:type="dxa"/>
               <w:left w:w="200" w:type="dxa"/>
-              <w:bottom w:w="50" w:type="dxa"/>
+              <w:bottom w:w="80" w:type="dxa"/>
               <w:right w:w="200" w:type="dxa"/>
             </w:tcMar>
           </w:tcPr>
           <w:p>
             <w:pPr>
-              <w:spacing w:before="36" w:after="36"/>
+              <w:spacing w:before="20" w:after="60"/>
             </w:pPr>
             <w:r>
               <w:rPr>
@@ -10557,15 +10557,15 @@
             </w:tcBorders>
             <w:shd w:val="clear" w:color="auto" w:fill="F5F5F0"/>
             <w:tcMar>
-              <w:top w:w="50" w:type="dxa"/>
+              <w:top w:w="80" w:type="dxa"/>
               <w:left w:w="200" w:type="dxa"/>
-              <w:bottom w:w="50" w:type="dxa"/>
+              <w:bottom w:w="80" w:type="dxa"/>
               <w:right w:w="200" w:type="dxa"/>
             </w:tcMar>
           </w:tcPr>
           <w:p>
             <w:pPr>
-              <w:spacing w:before="36" w:after="36"/>
+              <w:spacing w:before="20" w:after="60"/>
             </w:pPr>
             <w:r>
               <w:rPr>
@@ -10591,15 +10591,15 @@
             </w:tcBorders>
             <w:shd w:val="clear" w:color="auto" w:fill="F5F5F0"/>
             <w:tcMar>
-              <w:top w:w="50" w:type="dxa"/>
+              <w:top w:w="80" w:type="dxa"/>
               <w:left w:w="200" w:type="dxa"/>
-              <w:bottom w:w="50" w:type="dxa"/>
+              <w:bottom w:w="80" w:type="dxa"/>
               <w:right w:w="200" w:type="dxa"/>
             </w:tcMar>
           </w:tcPr>
           <w:p>
             <w:pPr>
-              <w:spacing w:before="36" w:after="36"/>
+              <w:spacing w:before="20" w:after="60"/>
             </w:pPr>
             <w:r>
               <w:rPr>
@@ -10625,15 +10625,15 @@
             </w:tcBorders>
             <w:shd w:val="clear" w:color="auto" w:fill="F5F5F0"/>
             <w:tcMar>
-              <w:top w:w="50" w:type="dxa"/>
+              <w:top w:w="80" w:type="dxa"/>
               <w:left w:w="200" w:type="dxa"/>
-              <w:bottom w:w="50" w:type="dxa"/>
+              <w:bottom w:w="80" w:type="dxa"/>
               <w:right w:w="200" w:type="dxa"/>
             </w:tcMar>
           </w:tcPr>
           <w:p>
             <w:pPr>
-              <w:spacing w:before="36" w:after="36"/>
+              <w:spacing w:before="20" w:after="60"/>
             </w:pPr>
             <w:r>
               <w:rPr>
@@ -11002,18 +11002,18 @@
     <w:tbl>
       <w:tblPr>
         <w:tblStyle w:val="ae"/>
-        <w:tblW w:w="8640" w:type="dxa"/>
         <w:tblInd w:w="0" w:type="dxa"/>
-        <w:tblBorders>
-          <w:top w:val="single" w:sz="4" w:space="0" w:color="000000"/>
-          <w:left w:val="single" w:sz="4" w:space="0" w:color="000000"/>
-          <w:bottom w:val="single" w:sz="4" w:space="0" w:color="000000"/>
-          <w:right w:val="single" w:sz="4" w:space="0" w:color="000000"/>
-          <w:insideH w:val="single" w:sz="4" w:space="0" w:color="000000"/>
-          <w:insideV w:val="single" w:sz="4" w:space="0" w:color="000000"/>
-        </w:tblBorders>
         <w:tblLayout w:type="fixed"/>
         <w:tblLook w:val="0000" w:firstRow="0" w:lastRow="0" w:firstColumn="0" w:lastColumn="0" w:noHBand="0" w:noVBand="0"/>
+        <w:tblBorders>
+          <w:top w:val="single" w:sz="8" w:space="0" w:color="C8A000"/>
+          <w:left w:val="single" w:sz="8" w:space="0" w:color="C8A000"/>
+          <w:bottom w:val="single" w:sz="8" w:space="0" w:color="C8A000"/>
+          <w:right w:val="single" w:sz="8" w:space="0" w:color="C8A000"/>
+          <w:insideH w:val="none"/>
+          <w:insideV w:val="none"/>
+        </w:tblBorders>
+        <w:tblW w:w="5000" w:type="pct"/>
       </w:tblPr>
       <w:tblGrid>
         <w:gridCol w:w="8640"/>
@@ -11028,17 +11028,17 @@
               <w:bottom w:val="single" w:sz="4" w:space="0" w:color="C8A951"/>
               <w:right w:val="nil"/>
             </w:tcBorders>
+            <w:shd w:val="clear" w:color="auto" w:fill="1A1A2E"/>
             <w:tcMar>
-              <w:top w:w="100" w:type="dxa"/>
-              <w:left w:w="200" w:type="dxa"/>
-              <w:bottom w:w="100" w:type="dxa"/>
-              <w:right w:w="200" w:type="dxa"/>
+              <w:top w:w="160" w:type="dxa"/>
+              <w:left w:w="360" w:type="dxa"/>
+              <w:bottom w:w="160" w:type="dxa"/>
+              <w:right w:w="360" w:type="dxa"/>
             </w:tcMar>
-            <w:shd w:val="clear" w:color="auto" w:fill="1A1A2E"/>
           </w:tcPr>
           <w:p>
             <w:pPr>
-              <w:spacing w:before="60" w:after="60"/>
+              <w:spacing w:before="0" w:after="0"/>
             </w:pPr>
             <w:r>
               <w:rPr>
@@ -11082,15 +11082,15 @@
             </w:tcBorders>
             <w:shd w:val="clear" w:color="auto" w:fill="F5F5F0"/>
             <w:tcMar>
-              <w:top w:w="50" w:type="dxa"/>
+              <w:top w:w="80" w:type="dxa"/>
               <w:left w:w="200" w:type="dxa"/>
-              <w:bottom w:w="50" w:type="dxa"/>
+              <w:bottom w:w="80" w:type="dxa"/>
               <w:right w:w="200" w:type="dxa"/>
             </w:tcMar>
           </w:tcPr>
           <w:p>
             <w:pPr>
-              <w:spacing w:before="36" w:after="36"/>
+              <w:spacing w:before="20" w:after="60"/>
             </w:pPr>
             <w:r>
               <w:rPr>
@@ -11116,15 +11116,15 @@
             </w:tcBorders>
             <w:shd w:val="clear" w:color="auto" w:fill="F5F5F0"/>
             <w:tcMar>
-              <w:top w:w="50" w:type="dxa"/>
+              <w:top w:w="80" w:type="dxa"/>
               <w:left w:w="200" w:type="dxa"/>
-              <w:bottom w:w="50" w:type="dxa"/>
+              <w:bottom w:w="80" w:type="dxa"/>
               <w:right w:w="200" w:type="dxa"/>
             </w:tcMar>
           </w:tcPr>
           <w:p>
             <w:pPr>
-              <w:spacing w:before="36" w:after="36"/>
+              <w:spacing w:before="20" w:after="60"/>
             </w:pPr>
             <w:r>
               <w:rPr>
@@ -11150,15 +11150,15 @@
             </w:tcBorders>
             <w:shd w:val="clear" w:color="auto" w:fill="F5F5F0"/>
             <w:tcMar>
-              <w:top w:w="50" w:type="dxa"/>
+              <w:top w:w="80" w:type="dxa"/>
               <w:left w:w="200" w:type="dxa"/>
-              <w:bottom w:w="50" w:type="dxa"/>
+              <w:bottom w:w="80" w:type="dxa"/>
               <w:right w:w="200" w:type="dxa"/>
             </w:tcMar>
           </w:tcPr>
           <w:p>
             <w:pPr>
-              <w:spacing w:before="36" w:after="36"/>
+              <w:spacing w:before="20" w:after="60"/>
             </w:pPr>
             <w:r>
               <w:rPr>
@@ -11184,15 +11184,15 @@
             </w:tcBorders>
             <w:shd w:val="clear" w:color="auto" w:fill="F5F5F0"/>
             <w:tcMar>
-              <w:top w:w="50" w:type="dxa"/>
+              <w:top w:w="80" w:type="dxa"/>
               <w:left w:w="200" w:type="dxa"/>
-              <w:bottom w:w="50" w:type="dxa"/>
+              <w:bottom w:w="80" w:type="dxa"/>
               <w:right w:w="200" w:type="dxa"/>
             </w:tcMar>
           </w:tcPr>
           <w:p>
             <w:pPr>
-              <w:spacing w:before="36" w:after="36"/>
+              <w:spacing w:before="20" w:after="60"/>
             </w:pPr>
             <w:r>
               <w:rPr>
@@ -11218,15 +11218,15 @@
             </w:tcBorders>
             <w:shd w:val="clear" w:color="auto" w:fill="F5F5F0"/>
             <w:tcMar>
-              <w:top w:w="50" w:type="dxa"/>
+              <w:top w:w="80" w:type="dxa"/>
               <w:left w:w="200" w:type="dxa"/>
-              <w:bottom w:w="50" w:type="dxa"/>
+              <w:bottom w:w="80" w:type="dxa"/>
               <w:right w:w="200" w:type="dxa"/>
             </w:tcMar>
           </w:tcPr>
           <w:p>
             <w:pPr>
-              <w:spacing w:before="36" w:after="36"/>
+              <w:spacing w:before="20" w:after="60"/>
             </w:pPr>
             <w:r>
               <w:rPr>
@@ -11565,18 +11565,18 @@
     <w:tbl>
       <w:tblPr>
         <w:tblStyle w:val="af"/>
-        <w:tblW w:w="8640" w:type="dxa"/>
         <w:tblInd w:w="0" w:type="dxa"/>
-        <w:tblBorders>
-          <w:top w:val="single" w:sz="4" w:space="0" w:color="000000"/>
-          <w:left w:val="single" w:sz="4" w:space="0" w:color="000000"/>
-          <w:bottom w:val="single" w:sz="4" w:space="0" w:color="000000"/>
-          <w:right w:val="single" w:sz="4" w:space="0" w:color="000000"/>
-          <w:insideH w:val="single" w:sz="4" w:space="0" w:color="000000"/>
-          <w:insideV w:val="single" w:sz="4" w:space="0" w:color="000000"/>
-        </w:tblBorders>
         <w:tblLayout w:type="fixed"/>
         <w:tblLook w:val="0000" w:firstRow="0" w:lastRow="0" w:firstColumn="0" w:lastColumn="0" w:noHBand="0" w:noVBand="0"/>
+        <w:tblBorders>
+          <w:top w:val="single" w:sz="8" w:space="0" w:color="C8A000"/>
+          <w:left w:val="single" w:sz="8" w:space="0" w:color="C8A000"/>
+          <w:bottom w:val="single" w:sz="8" w:space="0" w:color="C8A000"/>
+          <w:right w:val="single" w:sz="8" w:space="0" w:color="C8A000"/>
+          <w:insideH w:val="none"/>
+          <w:insideV w:val="none"/>
+        </w:tblBorders>
+        <w:tblW w:w="5000" w:type="pct"/>
       </w:tblPr>
       <w:tblGrid>
         <w:gridCol w:w="8640"/>
@@ -11591,17 +11591,17 @@
               <w:bottom w:val="single" w:sz="4" w:space="0" w:color="C8A951"/>
               <w:right w:val="nil"/>
             </w:tcBorders>
+            <w:shd w:val="clear" w:color="auto" w:fill="1A1A2E"/>
             <w:tcMar>
-              <w:top w:w="100" w:type="dxa"/>
-              <w:left w:w="200" w:type="dxa"/>
-              <w:bottom w:w="100" w:type="dxa"/>
-              <w:right w:w="200" w:type="dxa"/>
+              <w:top w:w="160" w:type="dxa"/>
+              <w:left w:w="360" w:type="dxa"/>
+              <w:bottom w:w="160" w:type="dxa"/>
+              <w:right w:w="360" w:type="dxa"/>
             </w:tcMar>
-            <w:shd w:val="clear" w:color="auto" w:fill="1A1A2E"/>
           </w:tcPr>
           <w:p>
             <w:pPr>
-              <w:spacing w:before="60" w:after="60"/>
+              <w:spacing w:before="0" w:after="0"/>
             </w:pPr>
             <w:r>
               <w:rPr>
@@ -11627,15 +11627,15 @@
             </w:tcBorders>
             <w:shd w:val="clear" w:color="auto" w:fill="F5F5F0"/>
             <w:tcMar>
-              <w:top w:w="50" w:type="dxa"/>
+              <w:top w:w="80" w:type="dxa"/>
               <w:left w:w="200" w:type="dxa"/>
-              <w:bottom w:w="50" w:type="dxa"/>
+              <w:bottom w:w="80" w:type="dxa"/>
               <w:right w:w="200" w:type="dxa"/>
             </w:tcMar>
           </w:tcPr>
           <w:p>
             <w:pPr>
-              <w:spacing w:before="36" w:after="36"/>
+              <w:spacing w:before="20" w:after="60"/>
             </w:pPr>
             <w:r>
               <w:rPr>
@@ -11661,15 +11661,15 @@
             </w:tcBorders>
             <w:shd w:val="clear" w:color="auto" w:fill="F5F5F0"/>
             <w:tcMar>
-              <w:top w:w="50" w:type="dxa"/>
+              <w:top w:w="80" w:type="dxa"/>
               <w:left w:w="200" w:type="dxa"/>
-              <w:bottom w:w="50" w:type="dxa"/>
+              <w:bottom w:w="80" w:type="dxa"/>
               <w:right w:w="200" w:type="dxa"/>
             </w:tcMar>
           </w:tcPr>
           <w:p>
             <w:pPr>
-              <w:spacing w:before="36" w:after="36"/>
+              <w:spacing w:before="20" w:after="60"/>
             </w:pPr>
             <w:r>
               <w:rPr>
@@ -11695,15 +11695,15 @@
             </w:tcBorders>
             <w:shd w:val="clear" w:color="auto" w:fill="F5F5F0"/>
             <w:tcMar>
-              <w:top w:w="50" w:type="dxa"/>
+              <w:top w:w="80" w:type="dxa"/>
               <w:left w:w="200" w:type="dxa"/>
-              <w:bottom w:w="50" w:type="dxa"/>
+              <w:bottom w:w="80" w:type="dxa"/>
               <w:right w:w="200" w:type="dxa"/>
             </w:tcMar>
           </w:tcPr>
           <w:p>
             <w:pPr>
-              <w:spacing w:before="36" w:after="36"/>
+              <w:spacing w:before="20" w:after="60"/>
             </w:pPr>
             <w:r>
               <w:rPr>
@@ -11729,15 +11729,15 @@
             </w:tcBorders>
             <w:shd w:val="clear" w:color="auto" w:fill="F5F5F0"/>
             <w:tcMar>
-              <w:top w:w="50" w:type="dxa"/>
+              <w:top w:w="80" w:type="dxa"/>
               <w:left w:w="200" w:type="dxa"/>
-              <w:bottom w:w="50" w:type="dxa"/>
+              <w:bottom w:w="80" w:type="dxa"/>
               <w:right w:w="200" w:type="dxa"/>
             </w:tcMar>
           </w:tcPr>
           <w:p>
             <w:pPr>
-              <w:spacing w:before="36" w:after="36"/>
+              <w:spacing w:before="20" w:after="60"/>
             </w:pPr>
             <w:r>
               <w:rPr>
@@ -11763,15 +11763,15 @@
             </w:tcBorders>
             <w:shd w:val="clear" w:color="auto" w:fill="F5F5F0"/>
             <w:tcMar>
-              <w:top w:w="50" w:type="dxa"/>
+              <w:top w:w="80" w:type="dxa"/>
               <w:left w:w="200" w:type="dxa"/>
-              <w:bottom w:w="50" w:type="dxa"/>
+              <w:bottom w:w="80" w:type="dxa"/>
               <w:right w:w="200" w:type="dxa"/>
             </w:tcMar>
           </w:tcPr>
           <w:p>
             <w:pPr>
-              <w:spacing w:before="36" w:after="36"/>
+              <w:spacing w:before="20" w:after="60"/>
             </w:pPr>
             <w:r>
               <w:rPr>
@@ -11797,15 +11797,15 @@
             </w:tcBorders>
             <w:shd w:val="clear" w:color="auto" w:fill="F5F5F0"/>
             <w:tcMar>
-              <w:top w:w="50" w:type="dxa"/>
+              <w:top w:w="80" w:type="dxa"/>
               <w:left w:w="200" w:type="dxa"/>
-              <w:bottom w:w="50" w:type="dxa"/>
+              <w:bottom w:w="80" w:type="dxa"/>
               <w:right w:w="200" w:type="dxa"/>
             </w:tcMar>
           </w:tcPr>
           <w:p>
             <w:pPr>
-              <w:spacing w:before="36" w:after="36"/>
+              <w:spacing w:before="20" w:after="60"/>
             </w:pPr>
             <w:r>
               <w:rPr>
@@ -11831,15 +11831,15 @@
             </w:tcBorders>
             <w:shd w:val="clear" w:color="auto" w:fill="F5F5F0"/>
             <w:tcMar>
-              <w:top w:w="50" w:type="dxa"/>
+              <w:top w:w="80" w:type="dxa"/>
               <w:left w:w="200" w:type="dxa"/>
-              <w:bottom w:w="50" w:type="dxa"/>
+              <w:bottom w:w="80" w:type="dxa"/>
               <w:right w:w="200" w:type="dxa"/>
             </w:tcMar>
           </w:tcPr>
           <w:p>
             <w:pPr>
-              <w:spacing w:before="36" w:after="36"/>
+              <w:spacing w:before="20" w:after="60"/>
             </w:pPr>
             <w:r>
               <w:rPr>
@@ -11865,15 +11865,15 @@
             </w:tcBorders>
             <w:shd w:val="clear" w:color="auto" w:fill="F5F5F0"/>
             <w:tcMar>
-              <w:top w:w="50" w:type="dxa"/>
+              <w:top w:w="80" w:type="dxa"/>
               <w:left w:w="200" w:type="dxa"/>
-              <w:bottom w:w="50" w:type="dxa"/>
+              <w:bottom w:w="80" w:type="dxa"/>
               <w:right w:w="200" w:type="dxa"/>
             </w:tcMar>
           </w:tcPr>
           <w:p>
             <w:pPr>
-              <w:spacing w:before="36" w:after="36"/>
+              <w:spacing w:before="20" w:after="60"/>
             </w:pPr>
             <w:r>
               <w:rPr>
@@ -11899,15 +11899,15 @@
             </w:tcBorders>
             <w:shd w:val="clear" w:color="auto" w:fill="F5F5F0"/>
             <w:tcMar>
-              <w:top w:w="50" w:type="dxa"/>
+              <w:top w:w="80" w:type="dxa"/>
               <w:left w:w="200" w:type="dxa"/>
-              <w:bottom w:w="50" w:type="dxa"/>
+              <w:bottom w:w="80" w:type="dxa"/>
               <w:right w:w="200" w:type="dxa"/>
             </w:tcMar>
           </w:tcPr>
           <w:p>
             <w:pPr>
-              <w:spacing w:before="36" w:after="36"/>
+              <w:spacing w:before="20" w:after="60"/>
             </w:pPr>
             <w:r>
               <w:rPr>
@@ -11933,15 +11933,15 @@
             </w:tcBorders>
             <w:shd w:val="clear" w:color="auto" w:fill="F5F5F0"/>
             <w:tcMar>
-              <w:top w:w="50" w:type="dxa"/>
+              <w:top w:w="80" w:type="dxa"/>
               <w:left w:w="200" w:type="dxa"/>
-              <w:bottom w:w="50" w:type="dxa"/>
+              <w:bottom w:w="80" w:type="dxa"/>
               <w:right w:w="200" w:type="dxa"/>
             </w:tcMar>
           </w:tcPr>
           <w:p>
             <w:pPr>
-              <w:spacing w:before="36" w:after="36"/>
+              <w:spacing w:before="20" w:after="60"/>
             </w:pPr>
             <w:r>
               <w:rPr>
@@ -11967,15 +11967,15 @@
             </w:tcBorders>
             <w:shd w:val="clear" w:color="auto" w:fill="F5F5F0"/>
             <w:tcMar>
-              <w:top w:w="50" w:type="dxa"/>
+              <w:top w:w="80" w:type="dxa"/>
               <w:left w:w="200" w:type="dxa"/>
-              <w:bottom w:w="50" w:type="dxa"/>
+              <w:bottom w:w="80" w:type="dxa"/>
               <w:right w:w="200" w:type="dxa"/>
             </w:tcMar>
           </w:tcPr>
           <w:p>
             <w:pPr>
-              <w:spacing w:before="36" w:after="36"/>
+              <w:spacing w:before="20" w:after="60"/>
             </w:pPr>
             <w:r>
               <w:rPr>
@@ -12001,15 +12001,15 @@
             </w:tcBorders>
             <w:shd w:val="clear" w:color="auto" w:fill="F5F5F0"/>
             <w:tcMar>
-              <w:top w:w="50" w:type="dxa"/>
+              <w:top w:w="80" w:type="dxa"/>
               <w:left w:w="200" w:type="dxa"/>
-              <w:bottom w:w="50" w:type="dxa"/>
+              <w:bottom w:w="80" w:type="dxa"/>
               <w:right w:w="200" w:type="dxa"/>
             </w:tcMar>
           </w:tcPr>
           <w:p>
             <w:pPr>
-              <w:spacing w:before="36" w:after="36"/>
+              <w:spacing w:before="20" w:after="60"/>
             </w:pPr>
             <w:r>
               <w:rPr>
@@ -12636,18 +12636,18 @@
     <w:tbl>
       <w:tblPr>
         <w:tblStyle w:val="af0"/>
-        <w:tblW w:w="8640" w:type="dxa"/>
         <w:tblInd w:w="0" w:type="dxa"/>
-        <w:tblBorders>
-          <w:top w:val="single" w:sz="4" w:space="0" w:color="000000"/>
-          <w:left w:val="single" w:sz="4" w:space="0" w:color="000000"/>
-          <w:bottom w:val="single" w:sz="4" w:space="0" w:color="000000"/>
-          <w:right w:val="single" w:sz="4" w:space="0" w:color="000000"/>
-          <w:insideH w:val="single" w:sz="4" w:space="0" w:color="000000"/>
-          <w:insideV w:val="single" w:sz="4" w:space="0" w:color="000000"/>
-        </w:tblBorders>
         <w:tblLayout w:type="fixed"/>
         <w:tblLook w:val="0000" w:firstRow="0" w:lastRow="0" w:firstColumn="0" w:lastColumn="0" w:noHBand="0" w:noVBand="0"/>
+        <w:tblBorders>
+          <w:top w:val="single" w:sz="8" w:space="0" w:color="C8A000"/>
+          <w:left w:val="single" w:sz="8" w:space="0" w:color="C8A000"/>
+          <w:bottom w:val="single" w:sz="8" w:space="0" w:color="C8A000"/>
+          <w:right w:val="single" w:sz="8" w:space="0" w:color="C8A000"/>
+          <w:insideH w:val="none"/>
+          <w:insideV w:val="none"/>
+        </w:tblBorders>
+        <w:tblW w:w="5000" w:type="pct"/>
       </w:tblPr>
       <w:tblGrid>
         <w:gridCol w:w="8640"/>
@@ -12662,17 +12662,17 @@
               <w:bottom w:val="single" w:sz="4" w:space="0" w:color="C8A951"/>
               <w:right w:val="nil"/>
             </w:tcBorders>
+            <w:shd w:val="clear" w:color="auto" w:fill="1A1A2E"/>
             <w:tcMar>
-              <w:top w:w="100" w:type="dxa"/>
-              <w:left w:w="200" w:type="dxa"/>
-              <w:bottom w:w="100" w:type="dxa"/>
-              <w:right w:w="200" w:type="dxa"/>
+              <w:top w:w="160" w:type="dxa"/>
+              <w:left w:w="360" w:type="dxa"/>
+              <w:bottom w:w="160" w:type="dxa"/>
+              <w:right w:w="360" w:type="dxa"/>
             </w:tcMar>
-            <w:shd w:val="clear" w:color="auto" w:fill="1A1A2E"/>
           </w:tcPr>
           <w:p>
             <w:pPr>
-              <w:spacing w:before="60" w:after="60"/>
+              <w:spacing w:before="0" w:after="0"/>
             </w:pPr>
             <w:r>
               <w:rPr>
@@ -12698,15 +12698,15 @@
             </w:tcBorders>
             <w:shd w:val="clear" w:color="auto" w:fill="F5F5F0"/>
             <w:tcMar>
-              <w:top w:w="50" w:type="dxa"/>
+              <w:top w:w="80" w:type="dxa"/>
               <w:left w:w="200" w:type="dxa"/>
-              <w:bottom w:w="50" w:type="dxa"/>
+              <w:bottom w:w="80" w:type="dxa"/>
               <w:right w:w="200" w:type="dxa"/>
             </w:tcMar>
           </w:tcPr>
           <w:p>
             <w:pPr>
-              <w:spacing w:before="36" w:after="36"/>
+              <w:spacing w:before="20" w:after="60"/>
             </w:pPr>
             <w:r>
               <w:rPr>
@@ -12732,15 +12732,15 @@
             </w:tcBorders>
             <w:shd w:val="clear" w:color="auto" w:fill="F5F5F0"/>
             <w:tcMar>
-              <w:top w:w="50" w:type="dxa"/>
+              <w:top w:w="80" w:type="dxa"/>
               <w:left w:w="200" w:type="dxa"/>
-              <w:bottom w:w="50" w:type="dxa"/>
+              <w:bottom w:w="80" w:type="dxa"/>
               <w:right w:w="200" w:type="dxa"/>
             </w:tcMar>
           </w:tcPr>
           <w:p>
             <w:pPr>
-              <w:spacing w:before="36" w:after="36"/>
+              <w:spacing w:before="20" w:after="60"/>
             </w:pPr>
             <w:r>
               <w:rPr>
@@ -12766,15 +12766,15 @@
             </w:tcBorders>
             <w:shd w:val="clear" w:color="auto" w:fill="F5F5F0"/>
             <w:tcMar>
-              <w:top w:w="50" w:type="dxa"/>
+              <w:top w:w="80" w:type="dxa"/>
               <w:left w:w="200" w:type="dxa"/>
-              <w:bottom w:w="50" w:type="dxa"/>
+              <w:bottom w:w="80" w:type="dxa"/>
               <w:right w:w="200" w:type="dxa"/>
             </w:tcMar>
           </w:tcPr>
           <w:p>
             <w:pPr>
-              <w:spacing w:before="36" w:after="36"/>
+              <w:spacing w:before="20" w:after="60"/>
             </w:pPr>
             <w:r>
               <w:rPr>
@@ -12800,15 +12800,15 @@
             </w:tcBorders>
             <w:shd w:val="clear" w:color="auto" w:fill="F5F5F0"/>
             <w:tcMar>
-              <w:top w:w="50" w:type="dxa"/>
+              <w:top w:w="80" w:type="dxa"/>
               <w:left w:w="200" w:type="dxa"/>
-              <w:bottom w:w="50" w:type="dxa"/>
+              <w:bottom w:w="80" w:type="dxa"/>
               <w:right w:w="200" w:type="dxa"/>
             </w:tcMar>
           </w:tcPr>
           <w:p>
             <w:pPr>
-              <w:spacing w:before="36" w:after="36"/>
+              <w:spacing w:before="20" w:after="60"/>
             </w:pPr>
             <w:r>
               <w:rPr>
@@ -12834,15 +12834,15 @@
             </w:tcBorders>
             <w:shd w:val="clear" w:color="auto" w:fill="F5F5F0"/>
             <w:tcMar>
-              <w:top w:w="50" w:type="dxa"/>
+              <w:top w:w="80" w:type="dxa"/>
               <w:left w:w="200" w:type="dxa"/>
-              <w:bottom w:w="50" w:type="dxa"/>
+              <w:bottom w:w="80" w:type="dxa"/>
               <w:right w:w="200" w:type="dxa"/>
             </w:tcMar>
           </w:tcPr>
           <w:p>
             <w:pPr>
-              <w:spacing w:before="36" w:after="36"/>
+              <w:spacing w:before="20" w:after="60"/>
             </w:pPr>
             <w:r>
               <w:rPr>
@@ -13166,18 +13166,18 @@
     <w:tbl>
       <w:tblPr>
         <w:tblStyle w:val="af1"/>
-        <w:tblW w:w="8640" w:type="dxa"/>
         <w:tblInd w:w="0" w:type="dxa"/>
-        <w:tblBorders>
-          <w:top w:val="single" w:sz="4" w:space="0" w:color="000000"/>
-          <w:left w:val="single" w:sz="4" w:space="0" w:color="000000"/>
-          <w:bottom w:val="single" w:sz="4" w:space="0" w:color="000000"/>
-          <w:right w:val="single" w:sz="4" w:space="0" w:color="000000"/>
-          <w:insideH w:val="single" w:sz="4" w:space="0" w:color="000000"/>
-          <w:insideV w:val="single" w:sz="4" w:space="0" w:color="000000"/>
-        </w:tblBorders>
         <w:tblLayout w:type="fixed"/>
         <w:tblLook w:val="0000" w:firstRow="0" w:lastRow="0" w:firstColumn="0" w:lastColumn="0" w:noHBand="0" w:noVBand="0"/>
+        <w:tblBorders>
+          <w:top w:val="single" w:sz="8" w:space="0" w:color="C8A000"/>
+          <w:left w:val="single" w:sz="8" w:space="0" w:color="C8A000"/>
+          <w:bottom w:val="single" w:sz="8" w:space="0" w:color="C8A000"/>
+          <w:right w:val="single" w:sz="8" w:space="0" w:color="C8A000"/>
+          <w:insideH w:val="none"/>
+          <w:insideV w:val="none"/>
+        </w:tblBorders>
+        <w:tblW w:w="5000" w:type="pct"/>
       </w:tblPr>
       <w:tblGrid>
         <w:gridCol w:w="8640"/>
@@ -13192,17 +13192,17 @@
               <w:bottom w:val="single" w:sz="4" w:space="0" w:color="C8A951"/>
               <w:right w:val="nil"/>
             </w:tcBorders>
+            <w:shd w:val="clear" w:color="auto" w:fill="1A1A2E"/>
             <w:tcMar>
-              <w:top w:w="100" w:type="dxa"/>
-              <w:left w:w="200" w:type="dxa"/>
-              <w:bottom w:w="100" w:type="dxa"/>
-              <w:right w:w="200" w:type="dxa"/>
+              <w:top w:w="160" w:type="dxa"/>
+              <w:left w:w="360" w:type="dxa"/>
+              <w:bottom w:w="160" w:type="dxa"/>
+              <w:right w:w="360" w:type="dxa"/>
             </w:tcMar>
-            <w:shd w:val="clear" w:color="auto" w:fill="1A1A2E"/>
           </w:tcPr>
           <w:p>
             <w:pPr>
-              <w:spacing w:before="60" w:after="60"/>
+              <w:spacing w:before="0" w:after="0"/>
             </w:pPr>
             <w:r>
               <w:rPr>
@@ -13228,15 +13228,15 @@
             </w:tcBorders>
             <w:shd w:val="clear" w:color="auto" w:fill="F5F5F0"/>
             <w:tcMar>
-              <w:top w:w="50" w:type="dxa"/>
+              <w:top w:w="80" w:type="dxa"/>
               <w:left w:w="200" w:type="dxa"/>
-              <w:bottom w:w="50" w:type="dxa"/>
+              <w:bottom w:w="80" w:type="dxa"/>
               <w:right w:w="200" w:type="dxa"/>
             </w:tcMar>
           </w:tcPr>
           <w:p>
             <w:pPr>
-              <w:spacing w:before="36" w:after="36"/>
+              <w:spacing w:before="20" w:after="60"/>
             </w:pPr>
             <w:r>
               <w:rPr>
@@ -13262,15 +13262,15 @@
             </w:tcBorders>
             <w:shd w:val="clear" w:color="auto" w:fill="F5F5F0"/>
             <w:tcMar>
-              <w:top w:w="50" w:type="dxa"/>
+              <w:top w:w="80" w:type="dxa"/>
               <w:left w:w="200" w:type="dxa"/>
-              <w:bottom w:w="50" w:type="dxa"/>
+              <w:bottom w:w="80" w:type="dxa"/>
               <w:right w:w="200" w:type="dxa"/>
             </w:tcMar>
           </w:tcPr>
           <w:p>
             <w:pPr>
-              <w:spacing w:before="36" w:after="36"/>
+              <w:spacing w:before="20" w:after="60"/>
             </w:pPr>
             <w:r>
               <w:rPr>
@@ -13296,15 +13296,15 @@
             </w:tcBorders>
             <w:shd w:val="clear" w:color="auto" w:fill="F5F5F0"/>
             <w:tcMar>
-              <w:top w:w="50" w:type="dxa"/>
+              <w:top w:w="80" w:type="dxa"/>
               <w:left w:w="200" w:type="dxa"/>
-              <w:bottom w:w="50" w:type="dxa"/>
+              <w:bottom w:w="80" w:type="dxa"/>
               <w:right w:w="200" w:type="dxa"/>
             </w:tcMar>
           </w:tcPr>
           <w:p>
             <w:pPr>
-              <w:spacing w:before="36" w:after="36"/>
+              <w:spacing w:before="20" w:after="60"/>
             </w:pPr>
             <w:r>
               <w:rPr>
@@ -13330,15 +13330,15 @@
             </w:tcBorders>
             <w:shd w:val="clear" w:color="auto" w:fill="F5F5F0"/>
             <w:tcMar>
-              <w:top w:w="50" w:type="dxa"/>
+              <w:top w:w="80" w:type="dxa"/>
               <w:left w:w="200" w:type="dxa"/>
-              <w:bottom w:w="50" w:type="dxa"/>
+              <w:bottom w:w="80" w:type="dxa"/>
               <w:right w:w="200" w:type="dxa"/>
             </w:tcMar>
           </w:tcPr>
           <w:p>
             <w:pPr>
-              <w:spacing w:before="36" w:after="36"/>
+              <w:spacing w:before="20" w:after="60"/>
             </w:pPr>
             <w:r>
               <w:rPr>
@@ -13364,15 +13364,15 @@
             </w:tcBorders>
             <w:shd w:val="clear" w:color="auto" w:fill="F5F5F0"/>
             <w:tcMar>
-              <w:top w:w="50" w:type="dxa"/>
+              <w:top w:w="80" w:type="dxa"/>
               <w:left w:w="200" w:type="dxa"/>
-              <w:bottom w:w="50" w:type="dxa"/>
+              <w:bottom w:w="80" w:type="dxa"/>
               <w:right w:w="200" w:type="dxa"/>
             </w:tcMar>
           </w:tcPr>
           <w:p>
             <w:pPr>
-              <w:spacing w:before="36" w:after="36"/>
+              <w:spacing w:before="20" w:after="60"/>
             </w:pPr>
             <w:r>
               <w:rPr>
@@ -13398,15 +13398,15 @@
             </w:tcBorders>
             <w:shd w:val="clear" w:color="auto" w:fill="F5F5F0"/>
             <w:tcMar>
-              <w:top w:w="50" w:type="dxa"/>
+              <w:top w:w="80" w:type="dxa"/>
               <w:left w:w="200" w:type="dxa"/>
-              <w:bottom w:w="50" w:type="dxa"/>
+              <w:bottom w:w="80" w:type="dxa"/>
               <w:right w:w="200" w:type="dxa"/>
             </w:tcMar>
           </w:tcPr>
           <w:p>
             <w:pPr>
-              <w:spacing w:before="36" w:after="36"/>
+              <w:spacing w:before="20" w:after="60"/>
             </w:pPr>
             <w:r>
               <w:rPr>
@@ -13833,18 +13833,18 @@
     <w:tbl>
       <w:tblPr>
         <w:tblStyle w:val="af2"/>
-        <w:tblW w:w="8640" w:type="dxa"/>
         <w:tblInd w:w="0" w:type="dxa"/>
-        <w:tblBorders>
-          <w:top w:val="single" w:sz="4" w:space="0" w:color="000000"/>
-          <w:left w:val="single" w:sz="4" w:space="0" w:color="000000"/>
-          <w:bottom w:val="single" w:sz="4" w:space="0" w:color="000000"/>
-          <w:right w:val="single" w:sz="4" w:space="0" w:color="000000"/>
-          <w:insideH w:val="single" w:sz="4" w:space="0" w:color="000000"/>
-          <w:insideV w:val="single" w:sz="4" w:space="0" w:color="000000"/>
-        </w:tblBorders>
         <w:tblLayout w:type="fixed"/>
         <w:tblLook w:val="0000" w:firstRow="0" w:lastRow="0" w:firstColumn="0" w:lastColumn="0" w:noHBand="0" w:noVBand="0"/>
+        <w:tblBorders>
+          <w:top w:val="single" w:sz="8" w:space="0" w:color="C8A000"/>
+          <w:left w:val="single" w:sz="8" w:space="0" w:color="C8A000"/>
+          <w:bottom w:val="single" w:sz="8" w:space="0" w:color="C8A000"/>
+          <w:right w:val="single" w:sz="8" w:space="0" w:color="C8A000"/>
+          <w:insideH w:val="none"/>
+          <w:insideV w:val="none"/>
+        </w:tblBorders>
+        <w:tblW w:w="5000" w:type="pct"/>
       </w:tblPr>
       <w:tblGrid>
         <w:gridCol w:w="8640"/>
@@ -13861,15 +13861,15 @@
             </w:tcBorders>
             <w:shd w:val="clear" w:color="auto" w:fill="252525"/>
             <w:tcMar>
-              <w:top w:w="100" w:type="dxa"/>
-              <w:left w:w="200" w:type="dxa"/>
-              <w:bottom w:w="100" w:type="dxa"/>
-              <w:right w:w="200" w:type="dxa"/>
+              <w:top w:w="160" w:type="dxa"/>
+              <w:left w:w="360" w:type="dxa"/>
+              <w:bottom w:w="160" w:type="dxa"/>
+              <w:right w:w="360" w:type="dxa"/>
             </w:tcMar>
           </w:tcPr>
           <w:p>
             <w:pPr>
-              <w:spacing w:before="60" w:after="60"/>
+              <w:spacing w:before="0" w:after="0"/>
             </w:pPr>
             <w:r>
               <w:rPr>
@@ -13895,15 +13895,15 @@
             </w:tcBorders>
             <w:shd w:val="clear" w:color="auto" w:fill="F5F5F0"/>
             <w:tcMar>
-              <w:top w:w="50" w:type="dxa"/>
+              <w:top w:w="80" w:type="dxa"/>
               <w:left w:w="200" w:type="dxa"/>
-              <w:bottom w:w="50" w:type="dxa"/>
+              <w:bottom w:w="80" w:type="dxa"/>
               <w:right w:w="200" w:type="dxa"/>
             </w:tcMar>
           </w:tcPr>
           <w:p>
             <w:pPr>
-              <w:spacing w:before="36" w:after="36"/>
+              <w:spacing w:before="20" w:after="60"/>
             </w:pPr>
             <w:r>
               <w:rPr>
@@ -13929,15 +13929,15 @@
             </w:tcBorders>
             <w:shd w:val="clear" w:color="auto" w:fill="F5F5F0"/>
             <w:tcMar>
-              <w:top w:w="50" w:type="dxa"/>
+              <w:top w:w="80" w:type="dxa"/>
               <w:left w:w="200" w:type="dxa"/>
-              <w:bottom w:w="50" w:type="dxa"/>
+              <w:bottom w:w="80" w:type="dxa"/>
               <w:right w:w="200" w:type="dxa"/>
             </w:tcMar>
           </w:tcPr>
           <w:p>
             <w:pPr>
-              <w:spacing w:before="36" w:after="36"/>
+              <w:spacing w:before="20" w:after="60"/>
             </w:pPr>
             <w:r>
               <w:rPr>
@@ -13963,15 +13963,15 @@
             </w:tcBorders>
             <w:shd w:val="clear" w:color="auto" w:fill="F5F5F0"/>
             <w:tcMar>
-              <w:top w:w="50" w:type="dxa"/>
+              <w:top w:w="80" w:type="dxa"/>
               <w:left w:w="200" w:type="dxa"/>
-              <w:bottom w:w="50" w:type="dxa"/>
+              <w:bottom w:w="80" w:type="dxa"/>
               <w:right w:w="200" w:type="dxa"/>
             </w:tcMar>
           </w:tcPr>
           <w:p>
             <w:pPr>
-              <w:spacing w:before="36" w:after="36"/>
+              <w:spacing w:before="20" w:after="60"/>
             </w:pPr>
             <w:r>
               <w:rPr>
@@ -13997,15 +13997,15 @@
             </w:tcBorders>
             <w:shd w:val="clear" w:color="auto" w:fill="F5F5F0"/>
             <w:tcMar>
-              <w:top w:w="50" w:type="dxa"/>
+              <w:top w:w="80" w:type="dxa"/>
               <w:left w:w="200" w:type="dxa"/>
-              <w:bottom w:w="50" w:type="dxa"/>
+              <w:bottom w:w="80" w:type="dxa"/>
               <w:right w:w="200" w:type="dxa"/>
             </w:tcMar>
           </w:tcPr>
           <w:p>
             <w:pPr>
-              <w:spacing w:before="36" w:after="36"/>
+              <w:spacing w:before="20" w:after="60"/>
             </w:pPr>
             <w:r>
               <w:rPr>
@@ -14031,15 +14031,15 @@
             </w:tcBorders>
             <w:shd w:val="clear" w:color="auto" w:fill="F5F5F0"/>
             <w:tcMar>
-              <w:top w:w="50" w:type="dxa"/>
+              <w:top w:w="80" w:type="dxa"/>
               <w:left w:w="200" w:type="dxa"/>
-              <w:bottom w:w="50" w:type="dxa"/>
+              <w:bottom w:w="80" w:type="dxa"/>
               <w:right w:w="200" w:type="dxa"/>
             </w:tcMar>
           </w:tcPr>
           <w:p>
             <w:pPr>
-              <w:spacing w:before="36" w:after="36"/>
+              <w:spacing w:before="20" w:after="60"/>
             </w:pPr>
             <w:r>
               <w:rPr>
@@ -14065,15 +14065,15 @@
             </w:tcBorders>
             <w:shd w:val="clear" w:color="auto" w:fill="F5F5F0"/>
             <w:tcMar>
-              <w:top w:w="50" w:type="dxa"/>
+              <w:top w:w="80" w:type="dxa"/>
               <w:left w:w="200" w:type="dxa"/>
-              <w:bottom w:w="50" w:type="dxa"/>
+              <w:bottom w:w="80" w:type="dxa"/>
               <w:right w:w="200" w:type="dxa"/>
             </w:tcMar>
           </w:tcPr>
           <w:p>
             <w:pPr>
-              <w:spacing w:before="36" w:after="36"/>
+              <w:spacing w:before="20" w:after="60"/>
             </w:pPr>
             <w:r>
               <w:rPr>
@@ -14653,18 +14653,18 @@
     <w:tbl>
       <w:tblPr>
         <w:tblStyle w:val="af3"/>
-        <w:tblW w:w="8640" w:type="dxa"/>
         <w:tblInd w:w="0" w:type="dxa"/>
-        <w:tblBorders>
-          <w:top w:val="single" w:sz="4" w:space="0" w:color="000000"/>
-          <w:left w:val="single" w:sz="4" w:space="0" w:color="000000"/>
-          <w:bottom w:val="single" w:sz="4" w:space="0" w:color="000000"/>
-          <w:right w:val="single" w:sz="4" w:space="0" w:color="000000"/>
-          <w:insideH w:val="single" w:sz="4" w:space="0" w:color="000000"/>
-          <w:insideV w:val="single" w:sz="4" w:space="0" w:color="000000"/>
-        </w:tblBorders>
         <w:tblLayout w:type="fixed"/>
         <w:tblLook w:val="0000" w:firstRow="0" w:lastRow="0" w:firstColumn="0" w:lastColumn="0" w:noHBand="0" w:noVBand="0"/>
+        <w:tblBorders>
+          <w:top w:val="single" w:sz="8" w:space="0" w:color="C8A000"/>
+          <w:left w:val="single" w:sz="8" w:space="0" w:color="C8A000"/>
+          <w:bottom w:val="single" w:sz="8" w:space="0" w:color="C8A000"/>
+          <w:right w:val="single" w:sz="8" w:space="0" w:color="C8A000"/>
+          <w:insideH w:val="none"/>
+          <w:insideV w:val="none"/>
+        </w:tblBorders>
+        <w:tblW w:w="5000" w:type="pct"/>
       </w:tblPr>
       <w:tblGrid>
         <w:gridCol w:w="8640"/>
@@ -14679,17 +14679,17 @@
               <w:bottom w:val="single" w:sz="4" w:space="0" w:color="C8A951"/>
               <w:right w:val="nil"/>
             </w:tcBorders>
+            <w:shd w:val="clear" w:color="auto" w:fill="1A1A2E"/>
             <w:tcMar>
-              <w:top w:w="100" w:type="dxa"/>
-              <w:left w:w="200" w:type="dxa"/>
-              <w:bottom w:w="100" w:type="dxa"/>
-              <w:right w:w="200" w:type="dxa"/>
+              <w:top w:w="160" w:type="dxa"/>
+              <w:left w:w="360" w:type="dxa"/>
+              <w:bottom w:w="160" w:type="dxa"/>
+              <w:right w:w="360" w:type="dxa"/>
             </w:tcMar>
-            <w:shd w:val="clear" w:color="auto" w:fill="1A1A2E"/>
           </w:tcPr>
           <w:p>
             <w:pPr>
-              <w:spacing w:before="60" w:after="60"/>
+              <w:spacing w:before="0" w:after="0"/>
             </w:pPr>
             <w:r>
               <w:rPr>
@@ -14715,15 +14715,15 @@
             </w:tcBorders>
             <w:shd w:val="clear" w:color="auto" w:fill="F5F5F0"/>
             <w:tcMar>
-              <w:top w:w="50" w:type="dxa"/>
+              <w:top w:w="80" w:type="dxa"/>
               <w:left w:w="200" w:type="dxa"/>
-              <w:bottom w:w="50" w:type="dxa"/>
+              <w:bottom w:w="80" w:type="dxa"/>
               <w:right w:w="200" w:type="dxa"/>
             </w:tcMar>
           </w:tcPr>
           <w:p>
             <w:pPr>
-              <w:spacing w:before="36" w:after="36"/>
+              <w:spacing w:before="20" w:after="60"/>
             </w:pPr>
             <w:r>
               <w:rPr>
@@ -14749,15 +14749,15 @@
             </w:tcBorders>
             <w:shd w:val="clear" w:color="auto" w:fill="F5F5F0"/>
             <w:tcMar>
-              <w:top w:w="50" w:type="dxa"/>
+              <w:top w:w="80" w:type="dxa"/>
               <w:left w:w="200" w:type="dxa"/>
-              <w:bottom w:w="50" w:type="dxa"/>
+              <w:bottom w:w="80" w:type="dxa"/>
               <w:right w:w="200" w:type="dxa"/>
             </w:tcMar>
           </w:tcPr>
           <w:p>
             <w:pPr>
-              <w:spacing w:before="36" w:after="36"/>
+              <w:spacing w:before="20" w:after="60"/>
             </w:pPr>
             <w:r>
               <w:rPr>
@@ -14783,15 +14783,15 @@
             </w:tcBorders>
             <w:shd w:val="clear" w:color="auto" w:fill="F5F5F0"/>
             <w:tcMar>
-              <w:top w:w="50" w:type="dxa"/>
+              <w:top w:w="80" w:type="dxa"/>
               <w:left w:w="200" w:type="dxa"/>
-              <w:bottom w:w="50" w:type="dxa"/>
+              <w:bottom w:w="80" w:type="dxa"/>
               <w:right w:w="200" w:type="dxa"/>
             </w:tcMar>
           </w:tcPr>
           <w:p>
             <w:pPr>
-              <w:spacing w:before="36" w:after="36"/>
+              <w:spacing w:before="20" w:after="60"/>
             </w:pPr>
             <w:r>
               <w:rPr>
@@ -14817,15 +14817,15 @@
             </w:tcBorders>
             <w:shd w:val="clear" w:color="auto" w:fill="F5F5F0"/>
             <w:tcMar>
-              <w:top w:w="50" w:type="dxa"/>
+              <w:top w:w="80" w:type="dxa"/>
               <w:left w:w="200" w:type="dxa"/>
-              <w:bottom w:w="50" w:type="dxa"/>
+              <w:bottom w:w="80" w:type="dxa"/>
               <w:right w:w="200" w:type="dxa"/>
             </w:tcMar>
           </w:tcPr>
           <w:p>
             <w:pPr>
-              <w:spacing w:before="36" w:after="36"/>
+              <w:spacing w:before="20" w:after="60"/>
             </w:pPr>
             <w:r>
               <w:rPr>
@@ -14851,15 +14851,15 @@
             </w:tcBorders>
             <w:shd w:val="clear" w:color="auto" w:fill="F5F5F0"/>
             <w:tcMar>
-              <w:top w:w="50" w:type="dxa"/>
+              <w:top w:w="80" w:type="dxa"/>
               <w:left w:w="200" w:type="dxa"/>
-              <w:bottom w:w="50" w:type="dxa"/>
+              <w:bottom w:w="80" w:type="dxa"/>
               <w:right w:w="200" w:type="dxa"/>
             </w:tcMar>
           </w:tcPr>
           <w:p>
             <w:pPr>
-              <w:spacing w:before="36" w:after="36"/>
+              <w:spacing w:before="20" w:after="60"/>
             </w:pPr>
             <w:r>
               <w:rPr>
@@ -14885,15 +14885,15 @@
             </w:tcBorders>
             <w:shd w:val="clear" w:color="auto" w:fill="F5F5F0"/>
             <w:tcMar>
-              <w:top w:w="50" w:type="dxa"/>
+              <w:top w:w="80" w:type="dxa"/>
               <w:left w:w="200" w:type="dxa"/>
-              <w:bottom w:w="50" w:type="dxa"/>
+              <w:bottom w:w="80" w:type="dxa"/>
               <w:right w:w="200" w:type="dxa"/>
             </w:tcMar>
           </w:tcPr>
           <w:p>
             <w:pPr>
-              <w:spacing w:before="36" w:after="36"/>
+              <w:spacing w:before="20" w:after="60"/>
             </w:pPr>
             <w:r>
               <w:rPr>
@@ -14919,15 +14919,15 @@
             </w:tcBorders>
             <w:shd w:val="clear" w:color="auto" w:fill="252525"/>
             <w:tcMar>
-              <w:top w:w="100" w:type="dxa"/>
-              <w:left w:w="200" w:type="dxa"/>
-              <w:bottom w:w="100" w:type="dxa"/>
-              <w:right w:w="200" w:type="dxa"/>
+              <w:top w:w="160" w:type="dxa"/>
+              <w:left w:w="360" w:type="dxa"/>
+              <w:bottom w:w="160" w:type="dxa"/>
+              <w:right w:w="360" w:type="dxa"/>
             </w:tcMar>
           </w:tcPr>
           <w:p>
             <w:pPr>
-              <w:spacing w:before="60" w:after="60"/>
+              <w:spacing w:before="0" w:after="0"/>
             </w:pPr>
             <w:r>
               <w:rPr>
@@ -14953,15 +14953,15 @@
             </w:tcBorders>
             <w:shd w:val="clear" w:color="auto" w:fill="F5F5F0"/>
             <w:tcMar>
-              <w:top w:w="50" w:type="dxa"/>
+              <w:top w:w="80" w:type="dxa"/>
               <w:left w:w="200" w:type="dxa"/>
-              <w:bottom w:w="50" w:type="dxa"/>
+              <w:bottom w:w="80" w:type="dxa"/>
               <w:right w:w="200" w:type="dxa"/>
             </w:tcMar>
           </w:tcPr>
           <w:p>
             <w:pPr>
-              <w:spacing w:before="36" w:after="36"/>
+              <w:spacing w:before="20" w:after="60"/>
             </w:pPr>
             <w:r>
               <w:rPr>
@@ -14987,15 +14987,15 @@
             </w:tcBorders>
             <w:shd w:val="clear" w:color="auto" w:fill="F5F5F0"/>
             <w:tcMar>
-              <w:top w:w="50" w:type="dxa"/>
+              <w:top w:w="80" w:type="dxa"/>
               <w:left w:w="200" w:type="dxa"/>
-              <w:bottom w:w="50" w:type="dxa"/>
+              <w:bottom w:w="80" w:type="dxa"/>
               <w:right w:w="200" w:type="dxa"/>
             </w:tcMar>
           </w:tcPr>
           <w:p>
             <w:pPr>
-              <w:spacing w:before="36" w:after="36"/>
+              <w:spacing w:before="20" w:after="60"/>
             </w:pPr>
             <w:r>
               <w:rPr>
@@ -15021,15 +15021,15 @@
             </w:tcBorders>
             <w:shd w:val="clear" w:color="auto" w:fill="F5F5F0"/>
             <w:tcMar>
-              <w:top w:w="50" w:type="dxa"/>
+              <w:top w:w="80" w:type="dxa"/>
               <w:left w:w="200" w:type="dxa"/>
-              <w:bottom w:w="50" w:type="dxa"/>
+              <w:bottom w:w="80" w:type="dxa"/>
               <w:right w:w="200" w:type="dxa"/>
             </w:tcMar>
           </w:tcPr>
           <w:p>
             <w:pPr>
-              <w:spacing w:before="36" w:after="36"/>
+              <w:spacing w:before="20" w:after="60"/>
             </w:pPr>
             <w:r>
               <w:rPr>
@@ -15055,15 +15055,15 @@
             </w:tcBorders>
             <w:shd w:val="clear" w:color="auto" w:fill="F5F5F0"/>
             <w:tcMar>
-              <w:top w:w="50" w:type="dxa"/>
+              <w:top w:w="80" w:type="dxa"/>
               <w:left w:w="200" w:type="dxa"/>
-              <w:bottom w:w="50" w:type="dxa"/>
+              <w:bottom w:w="80" w:type="dxa"/>
               <w:right w:w="200" w:type="dxa"/>
             </w:tcMar>
           </w:tcPr>
           <w:p>
             <w:pPr>
-              <w:spacing w:before="36" w:after="36"/>
+              <w:spacing w:before="20" w:after="60"/>
             </w:pPr>
             <w:r>
               <w:rPr>
@@ -15089,15 +15089,15 @@
             </w:tcBorders>
             <w:shd w:val="clear" w:color="auto" w:fill="F5F5F0"/>
             <w:tcMar>
-              <w:top w:w="50" w:type="dxa"/>
+              <w:top w:w="80" w:type="dxa"/>
               <w:left w:w="200" w:type="dxa"/>
-              <w:bottom w:w="50" w:type="dxa"/>
+              <w:bottom w:w="80" w:type="dxa"/>
               <w:right w:w="200" w:type="dxa"/>
             </w:tcMar>
           </w:tcPr>
           <w:p>
             <w:pPr>
-              <w:spacing w:before="36" w:after="36"/>
+              <w:spacing w:before="20" w:after="60"/>
             </w:pPr>
             <w:r>
               <w:rPr>
@@ -15143,15 +15143,15 @@
             </w:tcBorders>
             <w:shd w:val="clear" w:color="auto" w:fill="F5F5F0"/>
             <w:tcMar>
-              <w:top w:w="50" w:type="dxa"/>
+              <w:top w:w="80" w:type="dxa"/>
               <w:left w:w="200" w:type="dxa"/>
-              <w:bottom w:w="50" w:type="dxa"/>
+              <w:bottom w:w="80" w:type="dxa"/>
               <w:right w:w="200" w:type="dxa"/>
             </w:tcMar>
           </w:tcPr>
           <w:p>
             <w:pPr>
-              <w:spacing w:before="36" w:after="36"/>
+              <w:spacing w:before="20" w:after="60"/>
             </w:pPr>
             <w:r>
               <w:rPr>
@@ -15177,15 +15177,15 @@
             </w:tcBorders>
             <w:shd w:val="clear" w:color="auto" w:fill="F5F5F0"/>
             <w:tcMar>
-              <w:top w:w="50" w:type="dxa"/>
+              <w:top w:w="80" w:type="dxa"/>
               <w:left w:w="200" w:type="dxa"/>
-              <w:bottom w:w="50" w:type="dxa"/>
+              <w:bottom w:w="80" w:type="dxa"/>
               <w:right w:w="200" w:type="dxa"/>
             </w:tcMar>
           </w:tcPr>
           <w:p>
             <w:pPr>
-              <w:spacing w:before="36" w:after="36"/>
+              <w:spacing w:before="20" w:after="60"/>
             </w:pPr>
             <w:r>
               <w:rPr>

</xml_diff>